<commit_message>
feat: Preguntas de Documentacion - nivel 7
</commit_message>
<xml_diff>
--- a/Documentos/guia_completada2_actualizada.docx
+++ b/Documentos/guia_completada2_actualizada.docx
@@ -1,6 +1,6 @@
 
 <file path=word/document.xml><?xml version="1.0" encoding="utf-8"?>
-<w:document xmlns:wpc="http://schemas.microsoft.com/office/word/2010/wordprocessingCanvas" xmlns:cx="http://schemas.microsoft.com/office/drawing/2014/chartex" xmlns:cx1="http://schemas.microsoft.com/office/drawing/2015/9/8/chartex" xmlns:cx2="http://schemas.microsoft.com/office/drawing/2015/10/21/chartex" xmlns:cx3="http://schemas.microsoft.com/office/drawing/2016/5/9/chartex" xmlns:cx4="http://schemas.microsoft.com/office/drawing/2016/5/10/chartex" xmlns:cx5="http://schemas.microsoft.com/office/drawing/2016/5/11/chartex" xmlns:cx6="http://schemas.microsoft.com/office/drawing/2016/5/12/chartex" xmlns:cx7="http://schemas.microsoft.com/office/drawing/2016/5/13/chartex" xmlns:cx8="http://schemas.microsoft.com/office/drawing/2016/5/14/chartex" xmlns:mc="http://schemas.openxmlformats.org/markup-compatibility/2006" xmlns:aink="http://schemas.microsoft.com/office/drawing/2016/ink" xmlns:am3d="http://schemas.microsoft.com/office/drawing/2017/model3d" xmlns:o="urn:schemas-microsoft-com:office:office" xmlns:oel="http://schemas.microsoft.com/office/2019/extlst" xmlns:r="http://schemas.openxmlformats.org/officeDocument/2006/relationships" xmlns:m="http://schemas.openxmlformats.org/officeDocument/2006/math" xmlns:v="urn:schemas-microsoft-com:vml" xmlns:wp14="http://schemas.microsoft.com/office/word/2010/wordprocessingDrawing" xmlns:wp="http://schemas.openxmlformats.org/drawingml/2006/wordprocessingDrawing" xmlns:w10="urn:schemas-microsoft-com:office:word" xmlns:w="http://schemas.openxmlformats.org/wordprocessingml/2006/main" xmlns:w14="http://schemas.microsoft.com/office/word/2010/wordml" xmlns:w15="http://schemas.microsoft.com/office/word/2012/wordml" xmlns:w16cex="http://schemas.microsoft.com/office/word/2018/wordml/cex" xmlns:w16cid="http://schemas.microsoft.com/office/word/2016/wordml/cid" xmlns:w16="http://schemas.microsoft.com/office/word/2018/wordml" xmlns:w16du="http://schemas.microsoft.com/office/word/2023/wordml/word16du" xmlns:w16sdtdh="http://schemas.microsoft.com/office/word/2020/wordml/sdtdatahash" xmlns:w16sdtfl="http://schemas.microsoft.com/office/word/2024/wordml/sdtformatlock" xmlns:w16se="http://schemas.microsoft.com/office/word/2015/wordml/symex" xmlns:wpg="http://schemas.microsoft.com/office/word/2010/wordprocessingGroup" xmlns:wpi="http://schemas.microsoft.com/office/word/2010/wordprocessingInk" xmlns:wne="http://schemas.microsoft.com/office/word/2006/wordml" xmlns:wps="http://schemas.microsoft.com/office/word/2010/wordprocessingShape" mc:Ignorable="w14 w15 w16se w16cid w16 w16cex w16sdtdh w16sdtfl w16du wp14">
+<w:document xmlns:wpc="http://schemas.microsoft.com/office/word/2010/wordprocessingCanvas" xmlns:cx="http://schemas.microsoft.com/office/drawing/2014/chartex" xmlns:cx1="http://schemas.microsoft.com/office/drawing/2015/9/8/chartex" xmlns:cx2="http://schemas.microsoft.com/office/drawing/2015/10/21/chartex" xmlns:cx3="http://schemas.microsoft.com/office/drawing/2016/5/9/chartex" xmlns:cx4="http://schemas.microsoft.com/office/drawing/2016/5/10/chartex" xmlns:cx5="http://schemas.microsoft.com/office/drawing/2016/5/11/chartex" xmlns:cx6="http://schemas.microsoft.com/office/drawing/2016/5/12/chartex" xmlns:cx7="http://schemas.microsoft.com/office/drawing/2016/5/13/chartex" xmlns:cx8="http://schemas.microsoft.com/office/drawing/2016/5/14/chartex" xmlns:mc="http://schemas.openxmlformats.org/markup-compatibility/2006" xmlns:aink="http://schemas.microsoft.com/office/drawing/2016/ink" xmlns:am3d="http://schemas.microsoft.com/office/drawing/2017/model3d" xmlns:o="urn:schemas-microsoft-com:office:office" xmlns:r="http://schemas.openxmlformats.org/officeDocument/2006/relationships" xmlns:m="http://schemas.openxmlformats.org/officeDocument/2006/math" xmlns:v="urn:schemas-microsoft-com:vml" xmlns:wp14="http://schemas.microsoft.com/office/word/2010/wordprocessingDrawing" xmlns:wp="http://schemas.openxmlformats.org/drawingml/2006/wordprocessingDrawing" xmlns:w10="urn:schemas-microsoft-com:office:word" xmlns:w="http://schemas.openxmlformats.org/wordprocessingml/2006/main" xmlns:w14="http://schemas.microsoft.com/office/word/2010/wordml" xmlns:w15="http://schemas.microsoft.com/office/word/2012/wordml" xmlns:w16cex="http://schemas.microsoft.com/office/word/2018/wordml/cex" xmlns:w16cid="http://schemas.microsoft.com/office/word/2016/wordml/cid" xmlns:w16="http://schemas.microsoft.com/office/word/2018/wordml" xmlns:w16sdtdh="http://schemas.microsoft.com/office/word/2020/wordml/sdtdatahash" xmlns:w16se="http://schemas.microsoft.com/office/word/2015/wordml/symex" xmlns:wpg="http://schemas.microsoft.com/office/word/2010/wordprocessingGroup" xmlns:wpi="http://schemas.microsoft.com/office/word/2010/wordprocessingInk" xmlns:wne="http://schemas.microsoft.com/office/word/2006/wordml" xmlns:wps="http://schemas.microsoft.com/office/word/2010/wordprocessingShape" mc:Ignorable="w14 w15 w16se w16cid w16 w16cex w16sdtdh wp14">
   <w:body>
     <w:p/>
     <w:p>
@@ -2671,7 +2671,7 @@
                 <w:sz w:val="19"/>
                 <w:szCs w:val="19"/>
               </w:rPr>
-              <w:t xml:space="preserve">Líneas 12–14</w:t>
+              <w:t>Líneas 12–14</w:t>
             </w:r>
           </w:p>
         </w:tc>
@@ -2699,7 +2699,7 @@
                 <w:sz w:val="19"/>
                 <w:szCs w:val="19"/>
               </w:rPr>
-              <w:t xml:space="preserve">nom[], p[] y cant[] son tres arrays separados que representan un solo producto. Si se agrega un producto, hay que actualizar los tres en el orden correcto o se corrompen los datos.</w:t>
+              <w:t>nom[], p[] y cant[] son tres arrays separados que representan un solo producto. Si se agrega un producto, hay que actualizar los tres en el orden correcto o se corrompen los datos.</w:t>
             </w:r>
           </w:p>
         </w:tc>
@@ -2787,7 +2787,7 @@
                 <w:sz w:val="19"/>
                 <w:szCs w:val="19"/>
               </w:rPr>
-              <w:t xml:space="preserve">Líneas 12–18</w:t>
+              <w:t>Líneas 12–18</w:t>
             </w:r>
           </w:p>
         </w:tc>
@@ -2815,7 +2815,7 @@
                 <w:sz w:val="19"/>
                 <w:szCs w:val="19"/>
               </w:rPr>
-              <w:t xml:space="preserve">Todos los campos son public static: cualquier clase puede modificar nom[], p[], cant[], nf, etc. sin ningún control. No hay encapsulamiento ni punto de entrada único para los datos.</w:t>
+              <w:t>Todos los campos son public static: cualquier clase puede modificar nom[], p[], cant[], nf, etc. sin ningún control. No hay encapsulamiento ni punto de entrada único para los datos.</w:t>
             </w:r>
           </w:p>
         </w:tc>
@@ -2903,7 +2903,7 @@
                 <w:sz w:val="19"/>
                 <w:szCs w:val="19"/>
               </w:rPr>
-              <w:t xml:space="preserve">Línea 17</w:t>
+              <w:t>Línea 17</w:t>
             </w:r>
           </w:p>
         </w:tc>
@@ -2931,7 +2931,7 @@
                 <w:sz w:val="19"/>
                 <w:szCs w:val="19"/>
               </w:rPr>
-              <w:t xml:space="preserve">String x = "El Buen Sabor" — el nombre del restaurante está fijo en el código. Para cambiar el nombre hay que buscar todas las copias; esta es la primera de cinco apariciones.</w:t>
+              <w:t>String x = "El Buen Sabor" — el nombre del restaurante está fijo en el código. Para cambiar el nombre hay que buscar todas las copias; esta es la primera de cinco apariciones.</w:t>
             </w:r>
           </w:p>
         </w:tc>
@@ -2963,6 +2963,7 @@
                 <w:sz w:val="19"/>
                 <w:szCs w:val="19"/>
               </w:rPr>
+              <w:lastRenderedPageBreak/>
               <w:t>4</w:t>
             </w:r>
           </w:p>
@@ -3019,7 +3020,7 @@
                 <w:sz w:val="19"/>
                 <w:szCs w:val="19"/>
               </w:rPr>
-              <w:t xml:space="preserve">Línea 18</w:t>
+              <w:t>Línea 18</w:t>
             </w:r>
           </w:p>
         </w:tc>
@@ -3047,7 +3048,7 @@
                 <w:sz w:val="19"/>
                 <w:szCs w:val="19"/>
               </w:rPr>
-              <w:t xml:space="preserve">String tmp = "" nunca se lee ni se actualiza de forma significativa. Es un campo que ocupa espacio mental sin aportar valor; cualquier lector pierde tiempo intentando entender su propósito.</w:t>
+              <w:t>String tmp = "" nunca se lee ni se actualiza de forma significativa. Es un campo que ocupa espacio mental sin aportar valor; cualquier lector pierde tiempo intentando entender su propósito.</w:t>
             </w:r>
           </w:p>
         </w:tc>
@@ -3135,7 +3136,7 @@
                 <w:sz w:val="19"/>
                 <w:szCs w:val="19"/>
               </w:rPr>
-              <w:t xml:space="preserve">Líneas 11–19</w:t>
+              <w:t>Líneas 11–19</w:t>
             </w:r>
           </w:p>
         </w:tc>
@@ -3163,7 +3164,7 @@
                 <w:sz w:val="19"/>
                 <w:szCs w:val="19"/>
               </w:rPr>
-              <w:t xml:space="preserve">La clase sólo declara campos estáticos públicos; no tiene constructor ni métodos de acceso. Es un contenedor de variables globales disfrazado de clase.</w:t>
+              <w:t>La clase sólo declara campos estáticos públicos; no tiene constructor ni métodos de acceso. Es un contenedor de variables globales disfrazado de clase.</w:t>
             </w:r>
           </w:p>
         </w:tc>
@@ -3251,7 +3252,7 @@
                 <w:sz w:val="19"/>
                 <w:szCs w:val="19"/>
               </w:rPr>
-              <w:t xml:space="preserve">Líneas 12–18</w:t>
+              <w:t>Líneas 12–18</w:t>
             </w:r>
           </w:p>
         </w:tc>
@@ -3279,7 +3280,7 @@
                 <w:sz w:val="19"/>
                 <w:szCs w:val="19"/>
               </w:rPr>
-              <w:t xml:space="preserve">nom, p, cant, ms, est, tot, nf, x, tmp: ningún nombre revela su intención. Un lector nuevo no puede saber que p son precios, ms es número de mesa, est es el estado activo o que nf cuenta facturas.</w:t>
+              <w:t>nom, p, cant, ms, est, tot, nf, x, tmp: ningún nombre revela su intención. Un lector nuevo no puede saber que p son precios, ms es número de mesa, est es el estado activo o que nf cuenta facturas.</w:t>
             </w:r>
           </w:p>
         </w:tc>
@@ -3305,7 +3306,6 @@
         <w:rPr>
           <w:color w:val="555555"/>
         </w:rPr>
-        <w:lastRenderedPageBreak/>
         <w:t>Contiene la lógica de cálculo del total de la factura en un único método de más de 80 líneas.</w:t>
       </w:r>
     </w:p>
@@ -3537,7 +3537,7 @@
                 <w:sz w:val="19"/>
                 <w:szCs w:val="19"/>
               </w:rPr>
-              <w:t xml:space="preserve">Línea 12</w:t>
+              <w:t>Línea 12</w:t>
             </w:r>
           </w:p>
         </w:tc>
@@ -3565,7 +3565,7 @@
                 <w:sz w:val="19"/>
                 <w:szCs w:val="19"/>
               </w:rPr>
-              <w:t xml:space="preserve">El método cuenta productos, calcula subtotal, aplica descuento, calcula IVA, aplica propina Y actualiza Datos.est y Datos.tot. Son al menos seis responsabilidades en un único bloque de ~55 líneas.</w:t>
+              <w:t>El método cuenta productos, calcula subtotal, aplica descuento, calcula IVA, aplica propina Y actualiza Datos.est y Datos.tot. Son al menos seis responsabilidades en un único bloque de ~55 líneas.</w:t>
             </w:r>
           </w:p>
         </w:tc>
@@ -3653,7 +3653,7 @@
                 <w:sz w:val="19"/>
                 <w:szCs w:val="19"/>
               </w:rPr>
-              <w:t xml:space="preserve">Líneas 24, 30, 43</w:t>
+              <w:t>Líneas 24, 30, 43</w:t>
             </w:r>
           </w:p>
         </w:tc>
@@ -3681,7 +3681,7 @@
                 <w:sz w:val="19"/>
                 <w:szCs w:val="19"/>
               </w:rPr>
-              <w:t xml:space="preserve">La tasa 0.19 (IVA) aparece tres veces: en la rama con descuento+propina, en la rama con descuento sin propina, y en la rama sin descuento. Si el IVA cambia hay que actualizar tres lugares.</w:t>
+              <w:t>La tasa 0.19 (IVA) aparece tres veces: en la rama con descuento+propina, en la rama con descuento sin propina, y en la rama sin descuento. Si el IVA cambia hay que actualizar tres lugares.</w:t>
             </w:r>
           </w:p>
         </w:tc>
@@ -3769,7 +3769,7 @@
                 <w:sz w:val="19"/>
                 <w:szCs w:val="19"/>
               </w:rPr>
-              <w:t xml:space="preserve">Líneas 22–43</w:t>
+              <w:t>Líneas 22–43</w:t>
             </w:r>
           </w:p>
         </w:tc>
@@ -3797,7 +3797,7 @@
                 <w:sz w:val="19"/>
                 <w:szCs w:val="19"/>
               </w:rPr>
-              <w:t xml:space="preserve">0.05 (descuento), 0.19 (IVA), 0.10 (propina), 50000 (umbral propina) y 3 (mínimo productos para descuento) son números mágicos sin nombre. Su significado sólo se infiere por contexto.</w:t>
+              <w:t>0.05 (descuento), 0.19 (IVA), 0.10 (propina), 50000 (umbral propina) y 3 (mínimo productos para descuento) son números mágicos sin nombre. Su significado sólo se infiere por contexto.</w:t>
             </w:r>
           </w:p>
         </w:tc>
@@ -3885,7 +3885,7 @@
                 <w:sz w:val="19"/>
                 <w:szCs w:val="19"/>
               </w:rPr>
-              <w:t xml:space="preserve">Líneas 20–44</w:t>
+              <w:t>Líneas 20–44</w:t>
             </w:r>
           </w:p>
         </w:tc>
@@ -3913,7 +3913,7 @@
                 <w:sz w:val="19"/>
                 <w:szCs w:val="19"/>
               </w:rPr>
-              <w:t xml:space="preserve">La estructura es if(cont&gt;3){ if(sub&gt;0){ if(aux&gt;50000){...}else{...} } } else{ if(sub&gt;50000){...}else{...} }. Con cuatro niveles de anidamiento el flujo es difícil de seguir y probar.</w:t>
+              <w:t>La estructura es if(cont&gt;3){ if(sub&gt;0){ if(aux&gt;50000){...}else{...} } } else{ if(sub&gt;50000){...}else{...} }. Con cuatro niveles de anidamiento el flujo es difícil de seguir y probar.</w:t>
             </w:r>
           </w:p>
         </w:tc>
@@ -4001,7 +4001,7 @@
                 <w:sz w:val="19"/>
                 <w:szCs w:val="19"/>
               </w:rPr>
-              <w:t xml:space="preserve">Líneas 32–35</w:t>
+              <w:t>Líneas 32–35</w:t>
             </w:r>
           </w:p>
         </w:tc>
@@ -4029,7 +4029,7 @@
                 <w:sz w:val="19"/>
                 <w:szCs w:val="19"/>
               </w:rPr>
-              <w:t xml:space="preserve">// version anterior - no borrar seguido de tres líneas comentadas. El código muerto contamina la lectura y genera duda sobre cuál es la lógica activa. El historial de versiones es para eso git.</w:t>
+              <w:t>// version anterior - no borrar seguido de tres líneas comentadas. El código muerto contamina la lectura y genera duda sobre cuál es la lógica activa. El historial de versiones es para eso git.</w:t>
             </w:r>
           </w:p>
         </w:tc>
@@ -4117,7 +4117,7 @@
                 <w:sz w:val="19"/>
                 <w:szCs w:val="19"/>
               </w:rPr>
-              <w:t xml:space="preserve">Línea 47</w:t>
+              <w:t>Línea 47</w:t>
             </w:r>
           </w:p>
         </w:tc>
@@ -4145,7 +4145,7 @@
                 <w:sz w:val="19"/>
                 <w:szCs w:val="19"/>
               </w:rPr>
-              <w:t xml:space="preserve">procesar(double a, double b, double c, double d, double e, int f, boolean g): siete parámetros sin nombres descriptivos. En la llamada no se puede saber qué es cada argumento sin leer la firma completa.</w:t>
+              <w:t>procesar(double a, double b, double c, double d, double e, int f, boolean g): siete parámetros sin nombres descriptivos. En la llamada no se puede saber qué es cada argumento sin leer la firma completa.</w:t>
             </w:r>
           </w:p>
         </w:tc>
@@ -4233,7 +4233,7 @@
                 <w:sz w:val="19"/>
                 <w:szCs w:val="19"/>
               </w:rPr>
-              <w:t xml:space="preserve">Línea 55</w:t>
+              <w:t>Línea 55</w:t>
             </w:r>
           </w:p>
         </w:tc>
@@ -4261,7 +4261,7 @@
                 <w:sz w:val="19"/>
                 <w:szCs w:val="19"/>
               </w:rPr>
-              <w:t xml:space="preserve">double tmp = iva; res = res + tmp — tmp sólo copia iva para sumarlo inmediatamente. La variable intermedia no añade claridad ni reutilización; es ruido que obliga a rastrear otro nombre.</w:t>
+              <w:t>double tmp = iva; res = res + tmp — tmp sólo copia iva para sumarlo inmediatamente. La variable intermedia no añade claridad ni reutilización; es ruido que obliga a rastrear otro nombre.</w:t>
             </w:r>
           </w:p>
         </w:tc>
@@ -4349,7 +4349,7 @@
                 <w:sz w:val="19"/>
                 <w:szCs w:val="19"/>
               </w:rPr>
-              <w:t xml:space="preserve">Línea 16</w:t>
+              <w:t>Línea 16</w:t>
             </w:r>
           </w:p>
         </w:tc>
@@ -4377,7 +4377,7 @@
                 <w:sz w:val="19"/>
                 <w:szCs w:val="19"/>
               </w:rPr>
-              <w:t xml:space="preserve">// multiplica precio por cantidad está justo antes de sub = sub + p[i]*cant[i]. El comentario repite en español lo que ya dice el código, sin añadir el por qué ni ninguna información extra.</w:t>
+              <w:t>// multiplica precio por cantidad está justo antes de sub = sub + p[i]*cant[i]. El comentario repite en español lo que ya dice el código, sin añadir el por qué ni ninguna información extra.</w:t>
             </w:r>
           </w:p>
         </w:tc>
@@ -4465,7 +4465,7 @@
                 <w:sz w:val="19"/>
                 <w:szCs w:val="19"/>
               </w:rPr>
-              <w:t xml:space="preserve">Líneas 19, 31, 44</w:t>
+              <w:t>Líneas 19, 31, 44</w:t>
             </w:r>
           </w:p>
         </w:tc>
@@ -4493,7 +4493,7 @@
                 <w:sz w:val="19"/>
                 <w:szCs w:val="19"/>
               </w:rPr>
-              <w:t xml:space="preserve">// fin while, // fin if sub&gt;0, // fin if-else cont cierran bloques que ya tienen llaves. Con buena indentación estos comentarios son innecesarios y distraen la lectura del código real.</w:t>
+              <w:t>// fin while, // fin if sub&gt;0, // fin if-else cont cierran bloques que ya tienen llaves. Con buena indentación estos comentarios son innecesarios y distraen la lectura del código real.</w:t>
             </w:r>
           </w:p>
         </w:tc>
@@ -4572,6 +4572,7 @@
                 <w:sz w:val="19"/>
                 <w:szCs w:val="19"/>
               </w:rPr>
+              <w:lastRenderedPageBreak/>
               <w:t>#</w:t>
             </w:r>
           </w:p>
@@ -4750,7 +4751,7 @@
                 <w:sz w:val="19"/>
                 <w:szCs w:val="19"/>
               </w:rPr>
-              <w:t xml:space="preserve">Línea 12</w:t>
+              <w:t>Línea 12</w:t>
             </w:r>
           </w:p>
         </w:tc>
@@ -4778,7 +4779,7 @@
                 <w:sz w:val="19"/>
                 <w:szCs w:val="19"/>
               </w:rPr>
-              <w:t xml:space="preserve">calcular(double pr, double cn, double dc, double iv, double pp, int ni, boolean ap): siete parámetros que duplican casi exactamente la firma de Proceso.procesar(). Dos métodos con la misma responsabilidad en clases distintas.</w:t>
+              <w:t>calcular(double pr, double cn, double dc, double iv, double pp, int ni, boolean ap): siete parámetros que duplican casi exactamente la firma de Proceso.procesar(). Dos métodos con la misma responsabilidad en clases distintas.</w:t>
             </w:r>
           </w:p>
         </w:tc>
@@ -4866,7 +4867,7 @@
                 <w:sz w:val="19"/>
                 <w:szCs w:val="19"/>
               </w:rPr>
-              <w:t xml:space="preserve">Línea 29</w:t>
+              <w:t>Línea 29</w:t>
             </w:r>
           </w:p>
         </w:tc>
@@ -4894,7 +4895,7 @@
                 <w:sz w:val="19"/>
                 <w:szCs w:val="19"/>
               </w:rPr>
-              <w:t xml:space="preserve">validar() devuelve boolean indicando si hay productos, pero también ejecuta Datos.tot = 0 cuando el pedido está vacío. Un nombre como validarYReiniciarSiVacio() describiría el comportamiento real.</w:t>
+              <w:t>validar() devuelve boolean indicando si hay productos, pero también ejecuta Datos.tot = 0 cuando el pedido está vacío. Un nombre como validarYReiniciarSiVacio() describiría el comportamiento real.</w:t>
             </w:r>
           </w:p>
         </w:tc>
@@ -4982,7 +4983,7 @@
                 <w:sz w:val="19"/>
                 <w:szCs w:val="19"/>
               </w:rPr>
-              <w:t xml:space="preserve">Línea 20</w:t>
+              <w:t>Línea 20</w:t>
             </w:r>
           </w:p>
         </w:tc>
@@ -5010,7 +5011,7 @@
                 <w:sz w:val="19"/>
                 <w:szCs w:val="19"/>
               </w:rPr>
-              <w:t xml:space="preserve">System.out.println("RESTAURANTE EL BUEN SABOR - calculo aplicado") dentro de un método de cálculo numérico. Tercera aparición del nombre hardcodeado; además, un método de cálculo no debería imprimir nada en pantalla.</w:t>
+              <w:t>System.out.println("RESTAURANTE EL BUEN SABOR - calculo aplicado") dentro de un método de cálculo numérico. Tercera aparición del nombre hardcodeado; además, un método de cálculo no debería imprimir nada en pantalla.</w:t>
             </w:r>
           </w:p>
         </w:tc>
@@ -5098,7 +5099,7 @@
                 <w:sz w:val="19"/>
                 <w:szCs w:val="19"/>
               </w:rPr>
-              <w:t xml:space="preserve">Líneas 32–47</w:t>
+              <w:t>Líneas 32–47</w:t>
             </w:r>
           </w:p>
         </w:tc>
@@ -5126,7 +5127,7 @@
                 <w:sz w:val="19"/>
                 <w:szCs w:val="19"/>
               </w:rPr>
-              <w:t xml:space="preserve">Dentro de reiniciar() hay un bloque de ~20 líneas comentadas con un método calcOld() y lógica antigua. El método productivo está al final, casi oculto entre el código muerto.</w:t>
+              <w:t>Dentro de reiniciar() hay un bloque de ~20 líneas comentadas con un método calcOld() y lógica antigua. El método productivo está al final, casi oculto entre el código muerto.</w:t>
             </w:r>
           </w:p>
         </w:tc>
@@ -5214,7 +5215,7 @@
                 <w:sz w:val="19"/>
                 <w:szCs w:val="19"/>
               </w:rPr>
-              <w:t xml:space="preserve">Líneas 17, 21</w:t>
+              <w:t>Líneas 17, 21</w:t>
             </w:r>
           </w:p>
         </w:tc>
@@ -5242,7 +5243,7 @@
                 <w:sz w:val="19"/>
                 <w:szCs w:val="19"/>
               </w:rPr>
-              <w:t xml:space="preserve">double tmp = res * iv; res = res + tmp y double aux2 = res; return aux2 — dos variables que sólo copian valores para operaciones inmediatas. Eliminables sin cambiar el resultado.</w:t>
+              <w:t>double tmp = res * iv; res = res + tmp y double aux2 = res; return aux2 — dos variables que sólo copian valores para operaciones inmediatas. Eliminables sin cambiar el resultado.</w:t>
             </w:r>
           </w:p>
         </w:tc>
@@ -5499,7 +5500,7 @@
                 <w:sz w:val="19"/>
                 <w:szCs w:val="19"/>
               </w:rPr>
-              <w:t xml:space="preserve">Líneas 34–78</w:t>
+              <w:t>Líneas 34–78</w:t>
             </w:r>
           </w:p>
         </w:tc>
@@ -5527,7 +5528,7 @@
                 <w:sz w:val="19"/>
                 <w:szCs w:val="19"/>
               </w:rPr>
-              <w:t xml:space="preserve">El método recalcula el subtotal, aplica descuento e IVA, imprime el encabezado, recorre los ítems, imprime los totales y además actualiza Datos.nf, Datos.est y Datos.tot. Son tres responsabilidades: calcular, mostrar y actualizar estado.</w:t>
+              <w:t>El método recalcula el subtotal, aplica descuento e IVA, imprime el encabezado, recorre los ítems, imprime los totales y además actualiza Datos.nf, Datos.est y Datos.tot. Son tres responsabilidades: calcular, mostrar y actualizar estado.</w:t>
             </w:r>
           </w:p>
         </w:tc>
@@ -5615,7 +5616,7 @@
                 <w:sz w:val="19"/>
                 <w:szCs w:val="19"/>
               </w:rPr>
-              <w:t xml:space="preserve">Líneas 35–50, 80–95</w:t>
+              <w:t>Líneas 35–50, 80–95</w:t>
             </w:r>
           </w:p>
         </w:tc>
@@ -5643,7 +5644,7 @@
                 <w:sz w:val="19"/>
                 <w:szCs w:val="19"/>
               </w:rPr>
-              <w:t xml:space="preserve">Ambos métodos contienen el mismo bloque de ~10 líneas que recorre Datos.cant[] para calcular sub, cont, aux, iva, tot y prop. Si la lógica de descuento cambia, hay que actualizarla en dos lugares.</w:t>
+              <w:t>Ambos métodos contienen el mismo bloque de ~10 líneas que recorre Datos.cant[] para calcular sub, cont, aux, iva, tot y prop. Si la lógica de descuento cambia, hay que actualizarla en dos lugares.</w:t>
             </w:r>
           </w:p>
         </w:tc>
@@ -5731,7 +5732,7 @@
                 <w:sz w:val="19"/>
                 <w:szCs w:val="19"/>
               </w:rPr>
-              <w:t xml:space="preserve">Líneas 34–78 y 79–110</w:t>
+              <w:t>Líneas 34–78 y 79–110</w:t>
             </w:r>
           </w:p>
         </w:tc>
@@ -5759,7 +5760,7 @@
                 <w:sz w:val="19"/>
                 <w:szCs w:val="19"/>
               </w:rPr>
-              <w:t xml:space="preserve">Las dos funciones comparten encabezado, cálculo completo, separadores y líneas de totales. La única diferencia real es que una lista cada ítem y la otra no. Todo lo demás es copia exacta.</w:t>
+              <w:t>Las dos funciones comparten encabezado, cálculo completo, separadores y líneas de totales. La única diferencia real es que una lista cada ítem y la otra no. Todo lo demás es copia exacta.</w:t>
             </w:r>
           </w:p>
         </w:tc>
@@ -5847,7 +5848,7 @@
                 <w:sz w:val="19"/>
                 <w:szCs w:val="19"/>
               </w:rPr>
-              <w:t xml:space="preserve">Líneas 14, 53, 98</w:t>
+              <w:t>Líneas 14, 53, 98</w:t>
             </w:r>
           </w:p>
         </w:tc>
@@ -5875,7 +5876,7 @@
                 <w:sz w:val="19"/>
                 <w:szCs w:val="19"/>
               </w:rPr>
-              <w:t xml:space="preserve">RESTAURANTE EL BUEN SABOR aparece hardcodeado en mostrarCarta(), imprimirFacturaCompleta() e imprimirFacturaResumen(). Es la cuarta aparición; también en la línea final "El Buen Sabor - Valledupar".</w:t>
+              <w:t>RESTAURANTE EL BUEN SABOR aparece hardcodeado en mostrarCarta(), imprimirFacturaCompleta() e imprimirFacturaResumen(). Es la cuarta aparición; también en la línea final "El Buen Sabor - Valledupar".</w:t>
             </w:r>
           </w:p>
         </w:tc>
@@ -5963,7 +5964,7 @@
                 <w:sz w:val="19"/>
                 <w:szCs w:val="19"/>
               </w:rPr>
-              <w:t xml:space="preserve">Líneas 19, 28, 62</w:t>
+              <w:t>Líneas 19, 28, 62</w:t>
             </w:r>
           </w:p>
         </w:tc>
@@ -5991,7 +5992,7 @@
                 <w:sz w:val="19"/>
                 <w:szCs w:val="19"/>
               </w:rPr>
-              <w:t xml:space="preserve">El formato "%-20s x%-6d $%,.0f%n" se repite en tres métodos sin extraerlo a una constante. Un cambio de formato requiere editar tres printf distintos.</w:t>
+              <w:t>El formato "%-20s x%-6d $%,.0f%n" se repite en tres métodos sin extraerlo a una constante. Un cambio de formato requiere editar tres printf distintos.</w:t>
             </w:r>
           </w:p>
         </w:tc>
@@ -6005,7 +6006,6 @@
         </w:pBdr>
       </w:pPr>
       <w:r>
-        <w:lastRenderedPageBreak/>
         <w:t>3.5 Main.java — El caos central</w:t>
       </w:r>
     </w:p>
@@ -6193,6 +6193,7 @@
                 <w:sz w:val="19"/>
                 <w:szCs w:val="19"/>
               </w:rPr>
+              <w:lastRenderedPageBreak/>
               <w:t>26</w:t>
             </w:r>
           </w:p>
@@ -6249,7 +6250,7 @@
                 <w:sz w:val="19"/>
                 <w:szCs w:val="19"/>
               </w:rPr>
-              <w:t xml:space="preserve">Líneas 14–132</w:t>
+              <w:t>Líneas 14–132</w:t>
             </w:r>
           </w:p>
         </w:tc>
@@ -6277,7 +6278,7 @@
                 <w:sz w:val="19"/>
                 <w:szCs w:val="19"/>
               </w:rPr>
-              <w:t xml:space="preserve">El método main tiene más de 100 líneas con el bucle del menú, validación de entradas, lógica de mesa, llamadas a impresión y manejo de errores mezclados. Ninguna de esas responsabilidades debería estar en main.</w:t>
+              <w:t>El método main tiene más de 100 líneas con el bucle del menú, validación de entradas, lógica de mesa, llamadas a impresión y manejo de errores mezclados. Ninguna de esas responsabilidades debería estar en main.</w:t>
             </w:r>
           </w:p>
         </w:tc>
@@ -6365,7 +6366,7 @@
                 <w:sz w:val="19"/>
                 <w:szCs w:val="19"/>
               </w:rPr>
-              <w:t xml:space="preserve">Línea 123</w:t>
+              <w:t>Línea 123</w:t>
             </w:r>
           </w:p>
         </w:tc>
@@ -6393,7 +6394,7 @@
                 <w:sz w:val="19"/>
                 <w:szCs w:val="19"/>
               </w:rPr>
-              <w:t xml:space="preserve">Scanner sc se crea al inicio y Scanner sc2 se crea dentro del bloque de opción inválida. Dos Scanner sobre el mismo System.in pueden generar comportamiento inesperado; el segundo es completamente innecesario.</w:t>
+              <w:t>Scanner sc se crea al inicio y Scanner sc2 se crea dentro del bloque de opción inválida. Dos Scanner sobre el mismo System.in pueden generar comportamiento inesperado; el segundo es completamente innecesario.</w:t>
             </w:r>
           </w:p>
         </w:tc>
@@ -6481,7 +6482,7 @@
                 <w:sz w:val="19"/>
                 <w:szCs w:val="19"/>
               </w:rPr>
-              <w:t xml:space="preserve">Línea 16</w:t>
+              <w:t>Línea 16</w:t>
             </w:r>
           </w:p>
         </w:tc>
@@ -6509,7 +6510,7 @@
                 <w:sz w:val="19"/>
                 <w:szCs w:val="19"/>
               </w:rPr>
-              <w:t xml:space="preserve">int x, String aux, int tmp, double m y boolean continuar se declaran al inicio pero nunca influyen en la lógica principal. Son variables de seguimiento que contaminan el alcance del método.</w:t>
+              <w:t>int x, String aux, int tmp, double m y boolean continuar se declaran al inicio pero nunca influyen en la lógica principal. Son variables de seguimiento que contaminan el alcance del método.</w:t>
             </w:r>
           </w:p>
         </w:tc>
@@ -6597,7 +6598,7 @@
                 <w:sz w:val="19"/>
                 <w:szCs w:val="19"/>
               </w:rPr>
-              <w:t xml:space="preserve">Líneas 43–63</w:t>
+              <w:t>Líneas 43–63</w:t>
             </w:r>
           </w:p>
         </w:tc>
@@ -6625,7 +6626,7 @@
                 <w:sz w:val="19"/>
                 <w:szCs w:val="19"/>
               </w:rPr>
-              <w:t xml:space="preserve">La validación del número de mesa y el cálculo m = Datos.p[n-1]*c viven dentro de main. Esa lógica pertenece a la capa de negocio o al modelo, no al punto de entrada del programa.</w:t>
+              <w:t>La validación del número de mesa y el cálculo m = Datos.p[n-1]*c viven dentro de main. Esa lógica pertenece a la capa de negocio o al modelo, no al punto de entrada del programa.</w:t>
             </w:r>
           </w:p>
         </w:tc>
@@ -6713,7 +6714,7 @@
                 <w:sz w:val="19"/>
                 <w:szCs w:val="19"/>
               </w:rPr>
-              <w:t xml:space="preserve">Línea 18</w:t>
+              <w:t>Línea 18</w:t>
             </w:r>
           </w:p>
         </w:tc>
@@ -6741,7 +6742,7 @@
                 <w:sz w:val="19"/>
                 <w:szCs w:val="19"/>
               </w:rPr>
-              <w:t xml:space="preserve">RESTAURANTE EL BUEN SABOR aparece en el encabezado impreso al inicio de main. Con esta quinta aparición, cambiar el nombre del restaurante requiere editar cinco archivos diferentes.</w:t>
+              <w:t>RESTAURANTE EL BUEN SABOR aparece en el encabezado impreso al inicio de main. Con esta quinta aparición, cambiar el nombre del restaurante requiere editar cinco archivos diferentes.</w:t>
             </w:r>
           </w:p>
         </w:tc>
@@ -6986,7 +6987,7 @@
                 <w:sz w:val="19"/>
                 <w:szCs w:val="19"/>
               </w:rPr>
-              <w:t xml:space="preserve">Todos los archivos .java</w:t>
+              <w:t>Todos los archivos .java</w:t>
             </w:r>
           </w:p>
         </w:tc>
@@ -7014,7 +7015,7 @@
                 <w:sz w:val="19"/>
                 <w:szCs w:val="19"/>
               </w:rPr>
-              <w:t xml:space="preserve">Ninguna línea tiene indentación coherente: todo el cuerpo de clases y métodos empieza en la columna 0. Es imposible distinguir visualmente el nivel de anidamiento sin leer las llaves.</w:t>
+              <w:t>Ninguna línea tiene indentación coherente: todo el cuerpo de clases y métodos empieza en la columna 0. Es imposible distinguir visualmente el nivel de anidamiento sin leer las llaves.</w:t>
             </w:r>
           </w:p>
         </w:tc>
@@ -7102,7 +7103,7 @@
                 <w:sz w:val="19"/>
                 <w:szCs w:val="19"/>
               </w:rPr>
-              <w:t xml:space="preserve">Todos los archivos .java</w:t>
+              <w:t>Todos los archivos .java</w:t>
             </w:r>
           </w:p>
         </w:tc>
@@ -7130,7 +7131,7 @@
                 <w:sz w:val="19"/>
                 <w:szCs w:val="19"/>
               </w:rPr>
-              <w:t xml:space="preserve">Algunas llaves de apertura van en línea con la declaración y otras en la línea siguiente, sin criterio consistente. La mezcla de estilos aumenta la carga cognitiva al leer el código.</w:t>
+              <w:t>Algunas llaves de apertura van en línea con la declaración y otras en la línea siguiente, sin criterio consistente. La mezcla de estilos aumenta la carga cognitiva al leer el código.</w:t>
             </w:r>
           </w:p>
         </w:tc>
@@ -7218,7 +7219,7 @@
                 <w:sz w:val="19"/>
                 <w:szCs w:val="19"/>
               </w:rPr>
-              <w:t xml:space="preserve">Todos los archivos .java</w:t>
+              <w:t>Todos los archivos .java</w:t>
             </w:r>
           </w:p>
         </w:tc>
@@ -7246,7 +7247,7 @@
                 <w:sz w:val="19"/>
                 <w:szCs w:val="19"/>
               </w:rPr>
-              <w:t xml:space="preserve">Secuencias como }// fin while }// fin if-else cont }// fin main apilan tres o más llaves de cierre en la misma línea, haciendo imposible saber a qué bloque corresponde cada una.</w:t>
+              <w:t>Secuencias como }// fin while }// fin if-else cont }// fin main apilan tres o más llaves de cierre en la misma línea, haciendo imposible saber a qué bloque corresponde cada una.</w:t>
             </w:r>
           </w:p>
         </w:tc>
@@ -7334,7 +7335,7 @@
                 <w:sz w:val="19"/>
                 <w:szCs w:val="19"/>
               </w:rPr>
-              <w:t xml:space="preserve">Todos los archivos .java</w:t>
+              <w:t>Todos los archivos .java</w:t>
             </w:r>
           </w:p>
         </w:tc>
@@ -7362,7 +7363,7 @@
                 <w:sz w:val="19"/>
                 <w:szCs w:val="19"/>
               </w:rPr>
-              <w:t xml:space="preserve">Líneas como public static int ms=0;public static int est=0; o int i=0;while(i&lt;...){...;i++;} ponen dos o más sentencias en una sola línea, dificultando la lectura y el debugging.</w:t>
+              <w:t>Líneas como public static int ms=0;public static int est=0; o int i=0;while(i&lt;...){...;i++;} ponen dos o más sentencias en una sola línea, dificultando la lectura y el debugging.</w:t>
             </w:r>
           </w:p>
         </w:tc>
@@ -7457,6 +7458,795 @@
       </w:r>
     </w:p>
     <w:p/>
+    <w:p/>
+    <w:p/>
+    <w:p/>
+    <w:p/>
+    <w:p/>
+    <w:p/>
+    <w:p/>
+    <w:tbl>
+      <w:tblPr>
+        <w:tblW w:w="9360" w:type="dxa"/>
+        <w:tblBorders>
+          <w:top w:val="single" w:sz="4" w:space="0" w:color="auto"/>
+          <w:left w:val="single" w:sz="4" w:space="0" w:color="auto"/>
+          <w:bottom w:val="single" w:sz="4" w:space="0" w:color="auto"/>
+          <w:right w:val="single" w:sz="4" w:space="0" w:color="auto"/>
+          <w:insideH w:val="single" w:sz="4" w:space="0" w:color="auto"/>
+          <w:insideV w:val="single" w:sz="4" w:space="0" w:color="auto"/>
+        </w:tblBorders>
+        <w:tblCellMar>
+          <w:left w:w="10" w:type="dxa"/>
+          <w:right w:w="10" w:type="dxa"/>
+        </w:tblCellMar>
+        <w:tblLook w:val="04A0" w:firstRow="1" w:lastRow="0" w:firstColumn="1" w:lastColumn="0" w:noHBand="0" w:noVBand="1"/>
+      </w:tblPr>
+      <w:tblGrid>
+        <w:gridCol w:w="9360"/>
+      </w:tblGrid>
+      <w:tr>
+        <w:tc>
+          <w:tcPr>
+            <w:tcW w:w="0" w:type="auto"/>
+            <w:tcBorders>
+              <w:top w:val="none" w:sz="0" w:space="0" w:color="FFFFFF"/>
+              <w:left w:val="none" w:sz="0" w:space="0" w:color="FFFFFF"/>
+              <w:bottom w:val="none" w:sz="0" w:space="0" w:color="FFFFFF"/>
+              <w:right w:val="none" w:sz="0" w:space="0" w:color="FFFFFF"/>
+            </w:tcBorders>
+            <w:shd w:val="clear" w:color="auto" w:fill="1A6B3C"/>
+            <w:tcMar>
+              <w:top w:w="160" w:type="dxa"/>
+              <w:left w:w="300" w:type="dxa"/>
+              <w:bottom w:w="160" w:type="dxa"/>
+              <w:right w:w="300" w:type="dxa"/>
+            </w:tcMar>
+          </w:tcPr>
+          <w:p>
+            <w:r>
+              <w:rPr>
+                <w:b/>
+                <w:bCs/>
+                <w:color w:val="FFFFFF"/>
+                <w:sz w:val="30"/>
+                <w:szCs w:val="30"/>
+              </w:rPr>
+              <w:t>7.  Preguntas de Reflexión</w:t>
+            </w:r>
+          </w:p>
+        </w:tc>
+      </w:tr>
+    </w:tbl>
+    <w:p>
+      <w:pPr>
+        <w:spacing w:before="80" w:after="80"/>
+        <w:jc w:val="both"/>
+      </w:pPr>
+      <w:r>
+        <w:rPr>
+          <w:color w:val="1A1A1A"/>
+        </w:rPr>
+        <w:t>Responder estas preguntas en el informe de entrega. Las respuestas deben demostrar comprensión profunda de los principios, no solo descripción de lo que se hizo.</w:t>
+      </w:r>
+    </w:p>
+    <w:tbl>
+      <w:tblPr>
+        <w:tblW w:w="9360" w:type="dxa"/>
+        <w:tblBorders>
+          <w:top w:val="single" w:sz="4" w:space="0" w:color="auto"/>
+          <w:left w:val="single" w:sz="4" w:space="0" w:color="auto"/>
+          <w:bottom w:val="single" w:sz="4" w:space="0" w:color="auto"/>
+          <w:right w:val="single" w:sz="4" w:space="0" w:color="auto"/>
+          <w:insideH w:val="single" w:sz="4" w:space="0" w:color="auto"/>
+          <w:insideV w:val="single" w:sz="4" w:space="0" w:color="auto"/>
+        </w:tblBorders>
+        <w:tblCellMar>
+          <w:left w:w="10" w:type="dxa"/>
+          <w:right w:w="10" w:type="dxa"/>
+        </w:tblCellMar>
+        <w:tblLook w:val="04A0" w:firstRow="1" w:lastRow="0" w:firstColumn="1" w:lastColumn="0" w:noHBand="0" w:noVBand="1"/>
+      </w:tblPr>
+      <w:tblGrid>
+        <w:gridCol w:w="700"/>
+        <w:gridCol w:w="8660"/>
+      </w:tblGrid>
+      <w:tr>
+        <w:tc>
+          <w:tcPr>
+            <w:tcW w:w="700" w:type="dxa"/>
+            <w:tcBorders>
+              <w:top w:val="single" w:sz="1" w:space="0" w:color="CCCCCC"/>
+              <w:left w:val="single" w:sz="1" w:space="0" w:color="CCCCCC"/>
+              <w:bottom w:val="single" w:sz="1" w:space="0" w:color="CCCCCC"/>
+              <w:right w:val="single" w:sz="1" w:space="0" w:color="CCCCCC"/>
+            </w:tcBorders>
+            <w:shd w:val="clear" w:color="auto" w:fill="1A6B3C"/>
+            <w:tcMar>
+              <w:top w:w="100" w:type="dxa"/>
+              <w:left w:w="100" w:type="dxa"/>
+              <w:bottom w:w="100" w:type="dxa"/>
+              <w:right w:w="100" w:type="dxa"/>
+            </w:tcMar>
+          </w:tcPr>
+          <w:p>
+            <w:pPr>
+              <w:jc w:val="center"/>
+            </w:pPr>
+            <w:r>
+              <w:rPr>
+                <w:b/>
+                <w:bCs/>
+                <w:color w:val="FFFFFF"/>
+              </w:rPr>
+              <w:t>1</w:t>
+            </w:r>
+          </w:p>
+        </w:tc>
+        <w:tc>
+          <w:tcPr>
+            <w:tcW w:w="8660" w:type="dxa"/>
+            <w:tcBorders>
+              <w:top w:val="single" w:sz="1" w:space="0" w:color="CCCCCC"/>
+              <w:left w:val="single" w:sz="1" w:space="0" w:color="CCCCCC"/>
+              <w:bottom w:val="single" w:sz="1" w:space="0" w:color="CCCCCC"/>
+              <w:right w:val="single" w:sz="1" w:space="0" w:color="CCCCCC"/>
+            </w:tcBorders>
+            <w:shd w:val="clear" w:color="auto" w:fill="FFF9E6"/>
+            <w:tcMar>
+              <w:top w:w="120" w:type="dxa"/>
+              <w:left w:w="200" w:type="dxa"/>
+              <w:bottom w:w="120" w:type="dxa"/>
+              <w:right w:w="200" w:type="dxa"/>
+            </w:tcMar>
+          </w:tcPr>
+          <w:p>
+            <w:r>
+              <w:rPr>
+                <w:color w:val="1A1A1A"/>
+              </w:rPr>
+              <w:t>¿Cuánto tiempo tardaste en entender el código original antes de poder modificarlo? ¿Qué parte fue más difícil de descifrar?</w:t>
+            </w:r>
+            <w:r>
+              <w:rPr>
+                <w:color w:val="1A1A1A"/>
+              </w:rPr>
+              <w:br/>
+            </w:r>
+            <w:r>
+              <w:rPr>
+                <w:color w:val="1A1A1A"/>
+              </w:rPr>
+              <w:br/>
+            </w:r>
+            <w:r>
+              <w:rPr>
+                <w:color w:val="1A1A1A"/>
+              </w:rPr>
+              <w:t xml:space="preserve">R/ Para entender el código </w:t>
+            </w:r>
+            <w:r>
+              <w:rPr>
+                <w:color w:val="1A1A1A"/>
+              </w:rPr>
+              <w:t xml:space="preserve">no fue tan difícil </w:t>
+            </w:r>
+            <w:r>
+              <w:rPr>
+                <w:color w:val="1A1A1A"/>
+              </w:rPr>
+              <w:t>pero tarde entre 1 a 2 horas</w:t>
+            </w:r>
+            <w:r>
+              <w:rPr>
+                <w:color w:val="1A1A1A"/>
+              </w:rPr>
+              <w:t xml:space="preserve"> los condicionales anidados con </w:t>
+            </w:r>
+            <w:r>
+              <w:rPr>
+                <w:color w:val="1A1A1A"/>
+              </w:rPr>
+              <w:t xml:space="preserve">los nombres de variables </w:t>
+            </w:r>
+            <w:r>
+              <w:rPr>
+                <w:color w:val="1A1A1A"/>
+              </w:rPr>
+              <w:t>que no eran descriptivas</w:t>
+            </w:r>
+            <w:r>
+              <w:rPr>
+                <w:color w:val="1A1A1A"/>
+              </w:rPr>
+              <w:t xml:space="preserve"> </w:t>
+            </w:r>
+            <w:r>
+              <w:rPr>
+                <w:color w:val="1A1A1A"/>
+              </w:rPr>
+              <w:br/>
+            </w:r>
+          </w:p>
+        </w:tc>
+      </w:tr>
+      <w:tr>
+        <w:tc>
+          <w:tcPr>
+            <w:tcW w:w="700" w:type="dxa"/>
+            <w:tcBorders>
+              <w:top w:val="single" w:sz="1" w:space="0" w:color="CCCCCC"/>
+              <w:left w:val="single" w:sz="1" w:space="0" w:color="CCCCCC"/>
+              <w:bottom w:val="single" w:sz="1" w:space="0" w:color="CCCCCC"/>
+              <w:right w:val="single" w:sz="1" w:space="0" w:color="CCCCCC"/>
+            </w:tcBorders>
+            <w:shd w:val="clear" w:color="auto" w:fill="1A6B3C"/>
+            <w:tcMar>
+              <w:top w:w="100" w:type="dxa"/>
+              <w:left w:w="100" w:type="dxa"/>
+              <w:bottom w:w="100" w:type="dxa"/>
+              <w:right w:w="100" w:type="dxa"/>
+            </w:tcMar>
+          </w:tcPr>
+          <w:p>
+            <w:pPr>
+              <w:jc w:val="center"/>
+            </w:pPr>
+            <w:r>
+              <w:rPr>
+                <w:b/>
+                <w:bCs/>
+                <w:color w:val="FFFFFF"/>
+              </w:rPr>
+              <w:t>2</w:t>
+            </w:r>
+          </w:p>
+        </w:tc>
+        <w:tc>
+          <w:tcPr>
+            <w:tcW w:w="8660" w:type="dxa"/>
+            <w:tcBorders>
+              <w:top w:val="single" w:sz="1" w:space="0" w:color="CCCCCC"/>
+              <w:left w:val="single" w:sz="1" w:space="0" w:color="CCCCCC"/>
+              <w:bottom w:val="single" w:sz="1" w:space="0" w:color="CCCCCC"/>
+              <w:right w:val="single" w:sz="1" w:space="0" w:color="CCCCCC"/>
+            </w:tcBorders>
+            <w:shd w:val="clear" w:color="auto" w:fill="FFFFFF"/>
+            <w:tcMar>
+              <w:top w:w="120" w:type="dxa"/>
+              <w:left w:w="200" w:type="dxa"/>
+              <w:bottom w:w="120" w:type="dxa"/>
+              <w:right w:w="200" w:type="dxa"/>
+            </w:tcMar>
+          </w:tcPr>
+          <w:p>
+            <w:pPr>
+              <w:rPr>
+                <w:color w:val="1A1A1A"/>
+              </w:rPr>
+            </w:pPr>
+            <w:r>
+              <w:rPr>
+                <w:color w:val="1A1A1A"/>
+              </w:rPr>
+              <w:t>¿Cuál de las 34 malas prácticas te pareció la más peligrosa en un sistema real? ¿Por qué?</w:t>
+            </w:r>
+          </w:p>
+          <w:p>
+            <w:pPr>
+              <w:rPr>
+                <w:color w:val="1A1A1A"/>
+              </w:rPr>
+            </w:pPr>
+          </w:p>
+          <w:p>
+            <w:r>
+              <w:t xml:space="preserve">R/ El efecto segundario que </w:t>
+            </w:r>
+            <w:r>
+              <w:t xml:space="preserve">estaba en el </w:t>
+            </w:r>
+            <w:r>
+              <w:t>método</w:t>
+            </w:r>
+            <w:r>
+              <w:t xml:space="preserve"> </w:t>
+            </w:r>
+            <w:proofErr w:type="gramStart"/>
+            <w:r>
+              <w:t>validar(</w:t>
+            </w:r>
+            <w:proofErr w:type="gramEnd"/>
+            <w:r>
+              <w:t>) porque</w:t>
+            </w:r>
+            <w:r>
+              <w:t xml:space="preserve"> lee y modifica </w:t>
+            </w:r>
+            <w:r>
+              <w:t xml:space="preserve">y puede que al recibir </w:t>
+            </w:r>
+            <w:r>
+              <w:t xml:space="preserve">mucho </w:t>
+            </w:r>
+            <w:r>
+              <w:t xml:space="preserve">código a validar </w:t>
+            </w:r>
+            <w:r>
+              <w:t>salgan unos malos</w:t>
+            </w:r>
+          </w:p>
+        </w:tc>
+      </w:tr>
+      <w:tr>
+        <w:tc>
+          <w:tcPr>
+            <w:tcW w:w="700" w:type="dxa"/>
+            <w:tcBorders>
+              <w:top w:val="single" w:sz="1" w:space="0" w:color="CCCCCC"/>
+              <w:left w:val="single" w:sz="1" w:space="0" w:color="CCCCCC"/>
+              <w:bottom w:val="single" w:sz="1" w:space="0" w:color="CCCCCC"/>
+              <w:right w:val="single" w:sz="1" w:space="0" w:color="CCCCCC"/>
+            </w:tcBorders>
+            <w:shd w:val="clear" w:color="auto" w:fill="1A6B3C"/>
+            <w:tcMar>
+              <w:top w:w="100" w:type="dxa"/>
+              <w:left w:w="100" w:type="dxa"/>
+              <w:bottom w:w="100" w:type="dxa"/>
+              <w:right w:w="100" w:type="dxa"/>
+            </w:tcMar>
+          </w:tcPr>
+          <w:p>
+            <w:pPr>
+              <w:jc w:val="center"/>
+            </w:pPr>
+            <w:r>
+              <w:rPr>
+                <w:b/>
+                <w:bCs/>
+                <w:color w:val="FFFFFF"/>
+              </w:rPr>
+              <w:t>3</w:t>
+            </w:r>
+          </w:p>
+        </w:tc>
+        <w:tc>
+          <w:tcPr>
+            <w:tcW w:w="8660" w:type="dxa"/>
+            <w:tcBorders>
+              <w:top w:val="single" w:sz="1" w:space="0" w:color="CCCCCC"/>
+              <w:left w:val="single" w:sz="1" w:space="0" w:color="CCCCCC"/>
+              <w:bottom w:val="single" w:sz="1" w:space="0" w:color="CCCCCC"/>
+              <w:right w:val="single" w:sz="1" w:space="0" w:color="CCCCCC"/>
+            </w:tcBorders>
+            <w:shd w:val="clear" w:color="auto" w:fill="FFF9E6"/>
+            <w:tcMar>
+              <w:top w:w="120" w:type="dxa"/>
+              <w:left w:w="200" w:type="dxa"/>
+              <w:bottom w:w="120" w:type="dxa"/>
+              <w:right w:w="200" w:type="dxa"/>
+            </w:tcMar>
+          </w:tcPr>
+          <w:p>
+            <w:pPr>
+              <w:rPr>
+                <w:color w:val="1A1A1A"/>
+              </w:rPr>
+            </w:pPr>
+            <w:r>
+              <w:rPr>
+                <w:color w:val="1A1A1A"/>
+              </w:rPr>
+              <w:t>¿Qué pasaría si este sistema tuviera 50.000 líneas en lugar de ~200? ¿Cuánto costaría agregar un nuevo impuesto del 2%?</w:t>
+            </w:r>
+          </w:p>
+          <w:p>
+            <w:pPr>
+              <w:rPr>
+                <w:color w:val="1A1A1A"/>
+              </w:rPr>
+            </w:pPr>
+          </w:p>
+          <w:p>
+            <w:r>
+              <w:rPr>
+                <w:color w:val="1A1A1A"/>
+              </w:rPr>
+              <w:t>R/ El desa</w:t>
+            </w:r>
+            <w:r>
+              <w:rPr>
+                <w:color w:val="1A1A1A"/>
+              </w:rPr>
+              <w:t>rroll</w:t>
+            </w:r>
+            <w:r>
+              <w:rPr>
+                <w:color w:val="1A1A1A"/>
+              </w:rPr>
+              <w:t xml:space="preserve">ador le tocaría </w:t>
+            </w:r>
+            <w:r>
+              <w:rPr>
+                <w:color w:val="1A1A1A"/>
+              </w:rPr>
+              <w:t>revisar el código manualmente y se llevaría horas</w:t>
+            </w:r>
+            <w:r>
+              <w:rPr>
+                <w:color w:val="1A1A1A"/>
+              </w:rPr>
+              <w:t xml:space="preserve"> de </w:t>
+            </w:r>
+            <w:r>
+              <w:rPr>
+                <w:color w:val="1A1A1A"/>
+              </w:rPr>
+              <w:t>mira</w:t>
+            </w:r>
+            <w:r>
+              <w:rPr>
+                <w:color w:val="1A1A1A"/>
+              </w:rPr>
+              <w:t>ndo y compilando el código revisando si encontró todas las variables de IVA</w:t>
+            </w:r>
+          </w:p>
+        </w:tc>
+      </w:tr>
+      <w:tr>
+        <w:tc>
+          <w:tcPr>
+            <w:tcW w:w="700" w:type="dxa"/>
+            <w:tcBorders>
+              <w:top w:val="single" w:sz="1" w:space="0" w:color="CCCCCC"/>
+              <w:left w:val="single" w:sz="1" w:space="0" w:color="CCCCCC"/>
+              <w:bottom w:val="single" w:sz="1" w:space="0" w:color="CCCCCC"/>
+              <w:right w:val="single" w:sz="1" w:space="0" w:color="CCCCCC"/>
+            </w:tcBorders>
+            <w:shd w:val="clear" w:color="auto" w:fill="1A6B3C"/>
+            <w:tcMar>
+              <w:top w:w="100" w:type="dxa"/>
+              <w:left w:w="100" w:type="dxa"/>
+              <w:bottom w:w="100" w:type="dxa"/>
+              <w:right w:w="100" w:type="dxa"/>
+            </w:tcMar>
+          </w:tcPr>
+          <w:p>
+            <w:pPr>
+              <w:jc w:val="center"/>
+            </w:pPr>
+            <w:r>
+              <w:rPr>
+                <w:b/>
+                <w:bCs/>
+                <w:color w:val="FFFFFF"/>
+              </w:rPr>
+              <w:t>4</w:t>
+            </w:r>
+          </w:p>
+        </w:tc>
+        <w:tc>
+          <w:tcPr>
+            <w:tcW w:w="8660" w:type="dxa"/>
+            <w:tcBorders>
+              <w:top w:val="single" w:sz="1" w:space="0" w:color="CCCCCC"/>
+              <w:left w:val="single" w:sz="1" w:space="0" w:color="CCCCCC"/>
+              <w:bottom w:val="single" w:sz="1" w:space="0" w:color="CCCCCC"/>
+              <w:right w:val="single" w:sz="1" w:space="0" w:color="CCCCCC"/>
+            </w:tcBorders>
+            <w:shd w:val="clear" w:color="auto" w:fill="FFFFFF"/>
+            <w:tcMar>
+              <w:top w:w="120" w:type="dxa"/>
+              <w:left w:w="200" w:type="dxa"/>
+              <w:bottom w:w="120" w:type="dxa"/>
+              <w:right w:w="200" w:type="dxa"/>
+            </w:tcMar>
+          </w:tcPr>
+          <w:p>
+            <w:pPr>
+              <w:rPr>
+                <w:color w:val="1A1A1A"/>
+              </w:rPr>
+            </w:pPr>
+            <w:r>
+              <w:rPr>
+                <w:color w:val="1A1A1A"/>
+              </w:rPr>
+              <w:t>Identifica al menos un punto donde podrías haber introducido un bug accidentalmente al refactorizar. ¿Cómo lo detectarías?</w:t>
+            </w:r>
+            <w:r>
+              <w:rPr>
+                <w:color w:val="1A1A1A"/>
+              </w:rPr>
+              <w:t xml:space="preserve"> </w:t>
+            </w:r>
+          </w:p>
+          <w:p/>
+          <w:p>
+            <w:r>
+              <w:t>R/ Un error que me paso fue al momento de mandar la variable descuen</w:t>
+            </w:r>
+            <w:r>
+              <w:t>to en</w:t>
+            </w:r>
+            <w:r>
+              <w:t xml:space="preserve"> </w:t>
+            </w:r>
+            <w:proofErr w:type="spellStart"/>
+            <w:r>
+              <w:t>calcularPropina</w:t>
+            </w:r>
+            <w:proofErr w:type="spellEnd"/>
+            <w:r>
+              <w:t xml:space="preserve"> para recibir el valor de propina y era mandar el </w:t>
+            </w:r>
+            <w:r>
+              <w:t>descuento y el Iva</w:t>
+            </w:r>
+          </w:p>
+        </w:tc>
+      </w:tr>
+      <w:tr>
+        <w:tc>
+          <w:tcPr>
+            <w:tcW w:w="700" w:type="dxa"/>
+            <w:tcBorders>
+              <w:top w:val="single" w:sz="1" w:space="0" w:color="CCCCCC"/>
+              <w:left w:val="single" w:sz="1" w:space="0" w:color="CCCCCC"/>
+              <w:bottom w:val="single" w:sz="1" w:space="0" w:color="CCCCCC"/>
+              <w:right w:val="single" w:sz="1" w:space="0" w:color="CCCCCC"/>
+            </w:tcBorders>
+            <w:shd w:val="clear" w:color="auto" w:fill="1A6B3C"/>
+            <w:tcMar>
+              <w:top w:w="100" w:type="dxa"/>
+              <w:left w:w="100" w:type="dxa"/>
+              <w:bottom w:w="100" w:type="dxa"/>
+              <w:right w:w="100" w:type="dxa"/>
+            </w:tcMar>
+          </w:tcPr>
+          <w:p>
+            <w:pPr>
+              <w:jc w:val="center"/>
+            </w:pPr>
+            <w:r>
+              <w:rPr>
+                <w:b/>
+                <w:bCs/>
+                <w:color w:val="FFFFFF"/>
+              </w:rPr>
+              <w:t>5</w:t>
+            </w:r>
+          </w:p>
+        </w:tc>
+        <w:tc>
+          <w:tcPr>
+            <w:tcW w:w="8660" w:type="dxa"/>
+            <w:tcBorders>
+              <w:top w:val="single" w:sz="1" w:space="0" w:color="CCCCCC"/>
+              <w:left w:val="single" w:sz="1" w:space="0" w:color="CCCCCC"/>
+              <w:bottom w:val="single" w:sz="1" w:space="0" w:color="CCCCCC"/>
+              <w:right w:val="single" w:sz="1" w:space="0" w:color="CCCCCC"/>
+            </w:tcBorders>
+            <w:shd w:val="clear" w:color="auto" w:fill="FFF9E6"/>
+            <w:tcMar>
+              <w:top w:w="120" w:type="dxa"/>
+              <w:left w:w="200" w:type="dxa"/>
+              <w:bottom w:w="120" w:type="dxa"/>
+              <w:right w:w="200" w:type="dxa"/>
+            </w:tcMar>
+          </w:tcPr>
+          <w:p>
+            <w:pPr>
+              <w:rPr>
+                <w:color w:val="1A1A1A"/>
+              </w:rPr>
+            </w:pPr>
+            <w:r>
+              <w:rPr>
+                <w:color w:val="1A1A1A"/>
+              </w:rPr>
+              <w:t xml:space="preserve">El método </w:t>
+            </w:r>
+            <w:proofErr w:type="gramStart"/>
+            <w:r>
+              <w:rPr>
+                <w:color w:val="1A1A1A"/>
+              </w:rPr>
+              <w:t>validar(</w:t>
+            </w:r>
+            <w:proofErr w:type="gramEnd"/>
+            <w:r>
+              <w:rPr>
+                <w:color w:val="1A1A1A"/>
+              </w:rPr>
+              <w:t xml:space="preserve">) tiene un efecto secundario oculto: además de validar, modifica </w:t>
+            </w:r>
+            <w:proofErr w:type="spellStart"/>
+            <w:r>
+              <w:rPr>
+                <w:color w:val="1A1A1A"/>
+              </w:rPr>
+              <w:t>Datos.tot</w:t>
+            </w:r>
+            <w:proofErr w:type="spellEnd"/>
+            <w:r>
+              <w:rPr>
+                <w:color w:val="1A1A1A"/>
+              </w:rPr>
+              <w:t xml:space="preserve"> y </w:t>
+            </w:r>
+            <w:proofErr w:type="spellStart"/>
+            <w:r>
+              <w:rPr>
+                <w:color w:val="1A1A1A"/>
+              </w:rPr>
+              <w:t>Datos.tmp</w:t>
+            </w:r>
+            <w:proofErr w:type="spellEnd"/>
+            <w:r>
+              <w:rPr>
+                <w:color w:val="1A1A1A"/>
+              </w:rPr>
+              <w:t>. ¿Por qué este tipo de bugs son especialmente difíciles de encontrar en producción?</w:t>
+            </w:r>
+          </w:p>
+          <w:p>
+            <w:pPr>
+              <w:rPr>
+                <w:color w:val="1A1A1A"/>
+              </w:rPr>
+            </w:pPr>
+          </w:p>
+          <w:p>
+            <w:r>
+              <w:rPr>
+                <w:color w:val="1A1A1A"/>
+              </w:rPr>
+              <w:t>R/</w:t>
+            </w:r>
+            <w:r>
+              <w:rPr>
+                <w:color w:val="1A1A1A"/>
+              </w:rPr>
+              <w:t xml:space="preserve"> Primero por el nombre uno puede concluir que solamente valida y no modifica </w:t>
+            </w:r>
+            <w:r>
+              <w:rPr>
+                <w:color w:val="1A1A1A"/>
+              </w:rPr>
+              <w:t xml:space="preserve">y el bug solamente pasa </w:t>
+            </w:r>
+            <w:r>
+              <w:rPr>
+                <w:color w:val="1A1A1A"/>
+              </w:rPr>
+              <w:t xml:space="preserve">cuando se llama con el pedido </w:t>
+            </w:r>
+            <w:proofErr w:type="spellStart"/>
+            <w:r>
+              <w:rPr>
+                <w:color w:val="1A1A1A"/>
+              </w:rPr>
+              <w:t>vacio</w:t>
+            </w:r>
+            <w:proofErr w:type="spellEnd"/>
+            <w:r>
+              <w:rPr>
+                <w:color w:val="1A1A1A"/>
+              </w:rPr>
+              <w:t xml:space="preserve"> </w:t>
+            </w:r>
+          </w:p>
+        </w:tc>
+      </w:tr>
+      <w:tr>
+        <w:tc>
+          <w:tcPr>
+            <w:tcW w:w="700" w:type="dxa"/>
+            <w:tcBorders>
+              <w:top w:val="single" w:sz="1" w:space="0" w:color="CCCCCC"/>
+              <w:left w:val="single" w:sz="1" w:space="0" w:color="CCCCCC"/>
+              <w:bottom w:val="single" w:sz="1" w:space="0" w:color="CCCCCC"/>
+              <w:right w:val="single" w:sz="1" w:space="0" w:color="CCCCCC"/>
+            </w:tcBorders>
+            <w:shd w:val="clear" w:color="auto" w:fill="1A6B3C"/>
+            <w:tcMar>
+              <w:top w:w="100" w:type="dxa"/>
+              <w:left w:w="100" w:type="dxa"/>
+              <w:bottom w:w="100" w:type="dxa"/>
+              <w:right w:w="100" w:type="dxa"/>
+            </w:tcMar>
+          </w:tcPr>
+          <w:p>
+            <w:pPr>
+              <w:jc w:val="center"/>
+            </w:pPr>
+            <w:r>
+              <w:rPr>
+                <w:b/>
+                <w:bCs/>
+                <w:color w:val="FFFFFF"/>
+              </w:rPr>
+              <w:t>6</w:t>
+            </w:r>
+          </w:p>
+        </w:tc>
+        <w:tc>
+          <w:tcPr>
+            <w:tcW w:w="8660" w:type="dxa"/>
+            <w:tcBorders>
+              <w:top w:val="single" w:sz="1" w:space="0" w:color="CCCCCC"/>
+              <w:left w:val="single" w:sz="1" w:space="0" w:color="CCCCCC"/>
+              <w:bottom w:val="single" w:sz="1" w:space="0" w:color="CCCCCC"/>
+              <w:right w:val="single" w:sz="1" w:space="0" w:color="CCCCCC"/>
+            </w:tcBorders>
+            <w:shd w:val="clear" w:color="auto" w:fill="FFFFFF"/>
+            <w:tcMar>
+              <w:top w:w="120" w:type="dxa"/>
+              <w:left w:w="200" w:type="dxa"/>
+              <w:bottom w:w="120" w:type="dxa"/>
+              <w:right w:w="200" w:type="dxa"/>
+            </w:tcMar>
+          </w:tcPr>
+          <w:p>
+            <w:r>
+              <w:rPr>
+                <w:color w:val="1A1A1A"/>
+              </w:rPr>
+              <w:t xml:space="preserve">¿Cómo conectas este ejercicio con los casos reales de </w:t>
+            </w:r>
+            <w:proofErr w:type="spellStart"/>
+            <w:r>
+              <w:rPr>
+                <w:color w:val="1A1A1A"/>
+              </w:rPr>
+              <w:t>Knight</w:t>
+            </w:r>
+            <w:proofErr w:type="spellEnd"/>
+            <w:r>
+              <w:rPr>
+                <w:color w:val="1A1A1A"/>
+              </w:rPr>
+              <w:t xml:space="preserve"> Capital ($440M en 45 minutos), </w:t>
+            </w:r>
+            <w:proofErr w:type="spellStart"/>
+            <w:r>
+              <w:rPr>
+                <w:color w:val="1A1A1A"/>
+              </w:rPr>
+              <w:t>Southwest</w:t>
+            </w:r>
+            <w:proofErr w:type="spellEnd"/>
+            <w:r>
+              <w:rPr>
+                <w:color w:val="1A1A1A"/>
+              </w:rPr>
+              <w:t xml:space="preserve"> Airlines (17.000 vuelos cancelados) o Equifax (147M de registros filtrados) vistos en clase?</w:t>
+            </w:r>
+            <w:r>
+              <w:rPr>
+                <w:color w:val="1A1A1A"/>
+              </w:rPr>
+              <w:br/>
+            </w:r>
+            <w:r>
+              <w:br/>
+            </w:r>
+            <w:r>
+              <w:t xml:space="preserve">R/ Este trabajo tenia los mismos errores que le sucedió a esas empresas, códigos comentados, </w:t>
+            </w:r>
+            <w:r>
+              <w:t>variables sin significado y métodos bastantes extensos</w:t>
+            </w:r>
+          </w:p>
+        </w:tc>
+      </w:tr>
+    </w:tbl>
+    <w:p>
+      <w:pPr>
+        <w:ind w:left="708" w:hanging="708"/>
+      </w:pPr>
+    </w:p>
     <w:sectPr>
       <w:headerReference w:type="default" r:id="rId7"/>
       <w:footerReference w:type="default" r:id="rId8"/>
@@ -7470,7 +8260,7 @@
 </file>
 
 <file path=word/endnotes.xml><?xml version="1.0" encoding="utf-8"?>
-<w:endnotes xmlns:wpc="http://schemas.microsoft.com/office/word/2010/wordprocessingCanvas" xmlns:cx="http://schemas.microsoft.com/office/drawing/2014/chartex" xmlns:cx1="http://schemas.microsoft.com/office/drawing/2015/9/8/chartex" xmlns:cx2="http://schemas.microsoft.com/office/drawing/2015/10/21/chartex" xmlns:cx3="http://schemas.microsoft.com/office/drawing/2016/5/9/chartex" xmlns:cx4="http://schemas.microsoft.com/office/drawing/2016/5/10/chartex" xmlns:cx5="http://schemas.microsoft.com/office/drawing/2016/5/11/chartex" xmlns:cx6="http://schemas.microsoft.com/office/drawing/2016/5/12/chartex" xmlns:cx7="http://schemas.microsoft.com/office/drawing/2016/5/13/chartex" xmlns:cx8="http://schemas.microsoft.com/office/drawing/2016/5/14/chartex" xmlns:mc="http://schemas.openxmlformats.org/markup-compatibility/2006" xmlns:aink="http://schemas.microsoft.com/office/drawing/2016/ink" xmlns:am3d="http://schemas.microsoft.com/office/drawing/2017/model3d" xmlns:o="urn:schemas-microsoft-com:office:office" xmlns:oel="http://schemas.microsoft.com/office/2019/extlst" xmlns:r="http://schemas.openxmlformats.org/officeDocument/2006/relationships" xmlns:m="http://schemas.openxmlformats.org/officeDocument/2006/math" xmlns:v="urn:schemas-microsoft-com:vml" xmlns:wp14="http://schemas.microsoft.com/office/word/2010/wordprocessingDrawing" xmlns:wp="http://schemas.openxmlformats.org/drawingml/2006/wordprocessingDrawing" xmlns:w10="urn:schemas-microsoft-com:office:word" xmlns:w="http://schemas.openxmlformats.org/wordprocessingml/2006/main" xmlns:w14="http://schemas.microsoft.com/office/word/2010/wordml" xmlns:w15="http://schemas.microsoft.com/office/word/2012/wordml" xmlns:w16cex="http://schemas.microsoft.com/office/word/2018/wordml/cex" xmlns:w16cid="http://schemas.microsoft.com/office/word/2016/wordml/cid" xmlns:w16="http://schemas.microsoft.com/office/word/2018/wordml" xmlns:w16du="http://schemas.microsoft.com/office/word/2023/wordml/word16du" xmlns:w16sdtdh="http://schemas.microsoft.com/office/word/2020/wordml/sdtdatahash" xmlns:w16sdtfl="http://schemas.microsoft.com/office/word/2024/wordml/sdtformatlock" xmlns:w16se="http://schemas.microsoft.com/office/word/2015/wordml/symex" xmlns:wpg="http://schemas.microsoft.com/office/word/2010/wordprocessingGroup" xmlns:wpi="http://schemas.microsoft.com/office/word/2010/wordprocessingInk" xmlns:wne="http://schemas.microsoft.com/office/word/2006/wordml" xmlns:wps="http://schemas.microsoft.com/office/word/2010/wordprocessingShape" mc:Ignorable="w14 w15 w16se w16cid w16 w16cex w16sdtdh w16sdtfl w16du wp14">
+<w:endnotes xmlns:wpc="http://schemas.microsoft.com/office/word/2010/wordprocessingCanvas" xmlns:cx="http://schemas.microsoft.com/office/drawing/2014/chartex" xmlns:cx1="http://schemas.microsoft.com/office/drawing/2015/9/8/chartex" xmlns:cx2="http://schemas.microsoft.com/office/drawing/2015/10/21/chartex" xmlns:cx3="http://schemas.microsoft.com/office/drawing/2016/5/9/chartex" xmlns:cx4="http://schemas.microsoft.com/office/drawing/2016/5/10/chartex" xmlns:cx5="http://schemas.microsoft.com/office/drawing/2016/5/11/chartex" xmlns:cx6="http://schemas.microsoft.com/office/drawing/2016/5/12/chartex" xmlns:cx7="http://schemas.microsoft.com/office/drawing/2016/5/13/chartex" xmlns:cx8="http://schemas.microsoft.com/office/drawing/2016/5/14/chartex" xmlns:mc="http://schemas.openxmlformats.org/markup-compatibility/2006" xmlns:aink="http://schemas.microsoft.com/office/drawing/2016/ink" xmlns:am3d="http://schemas.microsoft.com/office/drawing/2017/model3d" xmlns:o="urn:schemas-microsoft-com:office:office" xmlns:r="http://schemas.openxmlformats.org/officeDocument/2006/relationships" xmlns:m="http://schemas.openxmlformats.org/officeDocument/2006/math" xmlns:v="urn:schemas-microsoft-com:vml" xmlns:wp14="http://schemas.microsoft.com/office/word/2010/wordprocessingDrawing" xmlns:wp="http://schemas.openxmlformats.org/drawingml/2006/wordprocessingDrawing" xmlns:w10="urn:schemas-microsoft-com:office:word" xmlns:w="http://schemas.openxmlformats.org/wordprocessingml/2006/main" xmlns:w14="http://schemas.microsoft.com/office/word/2010/wordml" xmlns:w15="http://schemas.microsoft.com/office/word/2012/wordml" xmlns:w16cex="http://schemas.microsoft.com/office/word/2018/wordml/cex" xmlns:w16cid="http://schemas.microsoft.com/office/word/2016/wordml/cid" xmlns:w16="http://schemas.microsoft.com/office/word/2018/wordml" xmlns:w16sdtdh="http://schemas.microsoft.com/office/word/2020/wordml/sdtdatahash" xmlns:w16se="http://schemas.microsoft.com/office/word/2015/wordml/symex" xmlns:wpg="http://schemas.microsoft.com/office/word/2010/wordprocessingGroup" xmlns:wpi="http://schemas.microsoft.com/office/word/2010/wordprocessingInk" xmlns:wne="http://schemas.microsoft.com/office/word/2006/wordml" xmlns:wps="http://schemas.microsoft.com/office/word/2010/wordprocessingShape" mc:Ignorable="w14 w15 w16se w16cid w16 w16cex w16sdtdh wp14">
   <w:endnote w:type="separator" w:id="-1">
     <w:p>
       <w:r>
@@ -7489,7 +8279,7 @@
 </file>
 
 <file path=word/footer1.xml><?xml version="1.0" encoding="utf-8"?>
-<w:ftr xmlns:wpc="http://schemas.microsoft.com/office/word/2010/wordprocessingCanvas" xmlns:cx="http://schemas.microsoft.com/office/drawing/2014/chartex" xmlns:cx1="http://schemas.microsoft.com/office/drawing/2015/9/8/chartex" xmlns:cx2="http://schemas.microsoft.com/office/drawing/2015/10/21/chartex" xmlns:cx3="http://schemas.microsoft.com/office/drawing/2016/5/9/chartex" xmlns:cx4="http://schemas.microsoft.com/office/drawing/2016/5/10/chartex" xmlns:cx5="http://schemas.microsoft.com/office/drawing/2016/5/11/chartex" xmlns:cx6="http://schemas.microsoft.com/office/drawing/2016/5/12/chartex" xmlns:cx7="http://schemas.microsoft.com/office/drawing/2016/5/13/chartex" xmlns:cx8="http://schemas.microsoft.com/office/drawing/2016/5/14/chartex" xmlns:mc="http://schemas.openxmlformats.org/markup-compatibility/2006" xmlns:aink="http://schemas.microsoft.com/office/drawing/2016/ink" xmlns:am3d="http://schemas.microsoft.com/office/drawing/2017/model3d" xmlns:o="urn:schemas-microsoft-com:office:office" xmlns:oel="http://schemas.microsoft.com/office/2019/extlst" xmlns:r="http://schemas.openxmlformats.org/officeDocument/2006/relationships" xmlns:m="http://schemas.openxmlformats.org/officeDocument/2006/math" xmlns:v="urn:schemas-microsoft-com:vml" xmlns:wp14="http://schemas.microsoft.com/office/word/2010/wordprocessingDrawing" xmlns:wp="http://schemas.openxmlformats.org/drawingml/2006/wordprocessingDrawing" xmlns:w10="urn:schemas-microsoft-com:office:word" xmlns:w="http://schemas.openxmlformats.org/wordprocessingml/2006/main" xmlns:w14="http://schemas.microsoft.com/office/word/2010/wordml" xmlns:w15="http://schemas.microsoft.com/office/word/2012/wordml" xmlns:w16cex="http://schemas.microsoft.com/office/word/2018/wordml/cex" xmlns:w16cid="http://schemas.microsoft.com/office/word/2016/wordml/cid" xmlns:w16="http://schemas.microsoft.com/office/word/2018/wordml" xmlns:w16du="http://schemas.microsoft.com/office/word/2023/wordml/word16du" xmlns:w16sdtdh="http://schemas.microsoft.com/office/word/2020/wordml/sdtdatahash" xmlns:w16sdtfl="http://schemas.microsoft.com/office/word/2024/wordml/sdtformatlock" xmlns:w16se="http://schemas.microsoft.com/office/word/2015/wordml/symex" xmlns:wpg="http://schemas.microsoft.com/office/word/2010/wordprocessingGroup" xmlns:wpi="http://schemas.microsoft.com/office/word/2010/wordprocessingInk" xmlns:wne="http://schemas.microsoft.com/office/word/2006/wordml" xmlns:wps="http://schemas.microsoft.com/office/word/2010/wordprocessingShape" mc:Ignorable="w14 w15 w16se w16cid w16 w16cex w16sdtdh w16sdtfl w16du wp14">
+<w:ftr xmlns:wpc="http://schemas.microsoft.com/office/word/2010/wordprocessingCanvas" xmlns:cx="http://schemas.microsoft.com/office/drawing/2014/chartex" xmlns:cx1="http://schemas.microsoft.com/office/drawing/2015/9/8/chartex" xmlns:cx2="http://schemas.microsoft.com/office/drawing/2015/10/21/chartex" xmlns:cx3="http://schemas.microsoft.com/office/drawing/2016/5/9/chartex" xmlns:cx4="http://schemas.microsoft.com/office/drawing/2016/5/10/chartex" xmlns:cx5="http://schemas.microsoft.com/office/drawing/2016/5/11/chartex" xmlns:cx6="http://schemas.microsoft.com/office/drawing/2016/5/12/chartex" xmlns:cx7="http://schemas.microsoft.com/office/drawing/2016/5/13/chartex" xmlns:cx8="http://schemas.microsoft.com/office/drawing/2016/5/14/chartex" xmlns:mc="http://schemas.openxmlformats.org/markup-compatibility/2006" xmlns:aink="http://schemas.microsoft.com/office/drawing/2016/ink" xmlns:am3d="http://schemas.microsoft.com/office/drawing/2017/model3d" xmlns:o="urn:schemas-microsoft-com:office:office" xmlns:r="http://schemas.openxmlformats.org/officeDocument/2006/relationships" xmlns:m="http://schemas.openxmlformats.org/officeDocument/2006/math" xmlns:v="urn:schemas-microsoft-com:vml" xmlns:wp14="http://schemas.microsoft.com/office/word/2010/wordprocessingDrawing" xmlns:wp="http://schemas.openxmlformats.org/drawingml/2006/wordprocessingDrawing" xmlns:w10="urn:schemas-microsoft-com:office:word" xmlns:w="http://schemas.openxmlformats.org/wordprocessingml/2006/main" xmlns:w14="http://schemas.microsoft.com/office/word/2010/wordml" xmlns:w15="http://schemas.microsoft.com/office/word/2012/wordml" xmlns:w16cex="http://schemas.microsoft.com/office/word/2018/wordml/cex" xmlns:w16cid="http://schemas.microsoft.com/office/word/2016/wordml/cid" xmlns:w16="http://schemas.microsoft.com/office/word/2018/wordml" xmlns:w16sdtdh="http://schemas.microsoft.com/office/word/2020/wordml/sdtdatahash" xmlns:w16se="http://schemas.microsoft.com/office/word/2015/wordml/symex" xmlns:wpg="http://schemas.microsoft.com/office/word/2010/wordprocessingGroup" xmlns:wpi="http://schemas.microsoft.com/office/word/2010/wordprocessingInk" xmlns:wne="http://schemas.microsoft.com/office/word/2006/wordml" xmlns:wps="http://schemas.microsoft.com/office/word/2010/wordprocessingShape" mc:Ignorable="w14 w15 w16se w16cid w16 w16cex w16sdtdh wp14">
   <w:p>
     <w:pPr>
       <w:pBdr>
@@ -7551,7 +8341,7 @@
 </file>
 
 <file path=word/footnotes.xml><?xml version="1.0" encoding="utf-8"?>
-<w:footnotes xmlns:wpc="http://schemas.microsoft.com/office/word/2010/wordprocessingCanvas" xmlns:cx="http://schemas.microsoft.com/office/drawing/2014/chartex" xmlns:cx1="http://schemas.microsoft.com/office/drawing/2015/9/8/chartex" xmlns:cx2="http://schemas.microsoft.com/office/drawing/2015/10/21/chartex" xmlns:cx3="http://schemas.microsoft.com/office/drawing/2016/5/9/chartex" xmlns:cx4="http://schemas.microsoft.com/office/drawing/2016/5/10/chartex" xmlns:cx5="http://schemas.microsoft.com/office/drawing/2016/5/11/chartex" xmlns:cx6="http://schemas.microsoft.com/office/drawing/2016/5/12/chartex" xmlns:cx7="http://schemas.microsoft.com/office/drawing/2016/5/13/chartex" xmlns:cx8="http://schemas.microsoft.com/office/drawing/2016/5/14/chartex" xmlns:mc="http://schemas.openxmlformats.org/markup-compatibility/2006" xmlns:aink="http://schemas.microsoft.com/office/drawing/2016/ink" xmlns:am3d="http://schemas.microsoft.com/office/drawing/2017/model3d" xmlns:o="urn:schemas-microsoft-com:office:office" xmlns:oel="http://schemas.microsoft.com/office/2019/extlst" xmlns:r="http://schemas.openxmlformats.org/officeDocument/2006/relationships" xmlns:m="http://schemas.openxmlformats.org/officeDocument/2006/math" xmlns:v="urn:schemas-microsoft-com:vml" xmlns:wp14="http://schemas.microsoft.com/office/word/2010/wordprocessingDrawing" xmlns:wp="http://schemas.openxmlformats.org/drawingml/2006/wordprocessingDrawing" xmlns:w10="urn:schemas-microsoft-com:office:word" xmlns:w="http://schemas.openxmlformats.org/wordprocessingml/2006/main" xmlns:w14="http://schemas.microsoft.com/office/word/2010/wordml" xmlns:w15="http://schemas.microsoft.com/office/word/2012/wordml" xmlns:w16cex="http://schemas.microsoft.com/office/word/2018/wordml/cex" xmlns:w16cid="http://schemas.microsoft.com/office/word/2016/wordml/cid" xmlns:w16="http://schemas.microsoft.com/office/word/2018/wordml" xmlns:w16du="http://schemas.microsoft.com/office/word/2023/wordml/word16du" xmlns:w16sdtdh="http://schemas.microsoft.com/office/word/2020/wordml/sdtdatahash" xmlns:w16sdtfl="http://schemas.microsoft.com/office/word/2024/wordml/sdtformatlock" xmlns:w16se="http://schemas.microsoft.com/office/word/2015/wordml/symex" xmlns:wpg="http://schemas.microsoft.com/office/word/2010/wordprocessingGroup" xmlns:wpi="http://schemas.microsoft.com/office/word/2010/wordprocessingInk" xmlns:wne="http://schemas.microsoft.com/office/word/2006/wordml" xmlns:wps="http://schemas.microsoft.com/office/word/2010/wordprocessingShape" mc:Ignorable="w14 w15 w16se w16cid w16 w16cex w16sdtdh w16sdtfl w16du wp14">
+<w:footnotes xmlns:wpc="http://schemas.microsoft.com/office/word/2010/wordprocessingCanvas" xmlns:cx="http://schemas.microsoft.com/office/drawing/2014/chartex" xmlns:cx1="http://schemas.microsoft.com/office/drawing/2015/9/8/chartex" xmlns:cx2="http://schemas.microsoft.com/office/drawing/2015/10/21/chartex" xmlns:cx3="http://schemas.microsoft.com/office/drawing/2016/5/9/chartex" xmlns:cx4="http://schemas.microsoft.com/office/drawing/2016/5/10/chartex" xmlns:cx5="http://schemas.microsoft.com/office/drawing/2016/5/11/chartex" xmlns:cx6="http://schemas.microsoft.com/office/drawing/2016/5/12/chartex" xmlns:cx7="http://schemas.microsoft.com/office/drawing/2016/5/13/chartex" xmlns:cx8="http://schemas.microsoft.com/office/drawing/2016/5/14/chartex" xmlns:mc="http://schemas.openxmlformats.org/markup-compatibility/2006" xmlns:aink="http://schemas.microsoft.com/office/drawing/2016/ink" xmlns:am3d="http://schemas.microsoft.com/office/drawing/2017/model3d" xmlns:o="urn:schemas-microsoft-com:office:office" xmlns:r="http://schemas.openxmlformats.org/officeDocument/2006/relationships" xmlns:m="http://schemas.openxmlformats.org/officeDocument/2006/math" xmlns:v="urn:schemas-microsoft-com:vml" xmlns:wp14="http://schemas.microsoft.com/office/word/2010/wordprocessingDrawing" xmlns:wp="http://schemas.openxmlformats.org/drawingml/2006/wordprocessingDrawing" xmlns:w10="urn:schemas-microsoft-com:office:word" xmlns:w="http://schemas.openxmlformats.org/wordprocessingml/2006/main" xmlns:w14="http://schemas.microsoft.com/office/word/2010/wordml" xmlns:w15="http://schemas.microsoft.com/office/word/2012/wordml" xmlns:w16cex="http://schemas.microsoft.com/office/word/2018/wordml/cex" xmlns:w16cid="http://schemas.microsoft.com/office/word/2016/wordml/cid" xmlns:w16="http://schemas.microsoft.com/office/word/2018/wordml" xmlns:w16sdtdh="http://schemas.microsoft.com/office/word/2020/wordml/sdtdatahash" xmlns:w16se="http://schemas.microsoft.com/office/word/2015/wordml/symex" xmlns:wpg="http://schemas.microsoft.com/office/word/2010/wordprocessingGroup" xmlns:wpi="http://schemas.microsoft.com/office/word/2010/wordprocessingInk" xmlns:wne="http://schemas.microsoft.com/office/word/2006/wordml" xmlns:wps="http://schemas.microsoft.com/office/word/2010/wordprocessingShape" mc:Ignorable="w14 w15 w16se w16cid w16 w16cex w16sdtdh wp14">
   <w:footnote w:type="separator" w:id="-1">
     <w:p>
       <w:r>
@@ -7570,7 +8360,7 @@
 </file>
 
 <file path=word/header1.xml><?xml version="1.0" encoding="utf-8"?>
-<w:hdr xmlns:wpc="http://schemas.microsoft.com/office/word/2010/wordprocessingCanvas" xmlns:cx="http://schemas.microsoft.com/office/drawing/2014/chartex" xmlns:cx1="http://schemas.microsoft.com/office/drawing/2015/9/8/chartex" xmlns:cx2="http://schemas.microsoft.com/office/drawing/2015/10/21/chartex" xmlns:cx3="http://schemas.microsoft.com/office/drawing/2016/5/9/chartex" xmlns:cx4="http://schemas.microsoft.com/office/drawing/2016/5/10/chartex" xmlns:cx5="http://schemas.microsoft.com/office/drawing/2016/5/11/chartex" xmlns:cx6="http://schemas.microsoft.com/office/drawing/2016/5/12/chartex" xmlns:cx7="http://schemas.microsoft.com/office/drawing/2016/5/13/chartex" xmlns:cx8="http://schemas.microsoft.com/office/drawing/2016/5/14/chartex" xmlns:mc="http://schemas.openxmlformats.org/markup-compatibility/2006" xmlns:aink="http://schemas.microsoft.com/office/drawing/2016/ink" xmlns:am3d="http://schemas.microsoft.com/office/drawing/2017/model3d" xmlns:o="urn:schemas-microsoft-com:office:office" xmlns:oel="http://schemas.microsoft.com/office/2019/extlst" xmlns:r="http://schemas.openxmlformats.org/officeDocument/2006/relationships" xmlns:m="http://schemas.openxmlformats.org/officeDocument/2006/math" xmlns:v="urn:schemas-microsoft-com:vml" xmlns:wp14="http://schemas.microsoft.com/office/word/2010/wordprocessingDrawing" xmlns:wp="http://schemas.openxmlformats.org/drawingml/2006/wordprocessingDrawing" xmlns:w10="urn:schemas-microsoft-com:office:word" xmlns:w="http://schemas.openxmlformats.org/wordprocessingml/2006/main" xmlns:w14="http://schemas.microsoft.com/office/word/2010/wordml" xmlns:w15="http://schemas.microsoft.com/office/word/2012/wordml" xmlns:w16cex="http://schemas.microsoft.com/office/word/2018/wordml/cex" xmlns:w16cid="http://schemas.microsoft.com/office/word/2016/wordml/cid" xmlns:w16="http://schemas.microsoft.com/office/word/2018/wordml" xmlns:w16du="http://schemas.microsoft.com/office/word/2023/wordml/word16du" xmlns:w16sdtdh="http://schemas.microsoft.com/office/word/2020/wordml/sdtdatahash" xmlns:w16sdtfl="http://schemas.microsoft.com/office/word/2024/wordml/sdtformatlock" xmlns:w16se="http://schemas.microsoft.com/office/word/2015/wordml/symex" xmlns:wpg="http://schemas.microsoft.com/office/word/2010/wordprocessingGroup" xmlns:wpi="http://schemas.microsoft.com/office/word/2010/wordprocessingInk" xmlns:wne="http://schemas.microsoft.com/office/word/2006/wordml" xmlns:wps="http://schemas.microsoft.com/office/word/2010/wordprocessingShape" mc:Ignorable="w14 w15 w16se w16cid w16 w16cex w16sdtdh w16sdtfl w16du wp14">
+<w:hdr xmlns:wpc="http://schemas.microsoft.com/office/word/2010/wordprocessingCanvas" xmlns:cx="http://schemas.microsoft.com/office/drawing/2014/chartex" xmlns:cx1="http://schemas.microsoft.com/office/drawing/2015/9/8/chartex" xmlns:cx2="http://schemas.microsoft.com/office/drawing/2015/10/21/chartex" xmlns:cx3="http://schemas.microsoft.com/office/drawing/2016/5/9/chartex" xmlns:cx4="http://schemas.microsoft.com/office/drawing/2016/5/10/chartex" xmlns:cx5="http://schemas.microsoft.com/office/drawing/2016/5/11/chartex" xmlns:cx6="http://schemas.microsoft.com/office/drawing/2016/5/12/chartex" xmlns:cx7="http://schemas.microsoft.com/office/drawing/2016/5/13/chartex" xmlns:cx8="http://schemas.microsoft.com/office/drawing/2016/5/14/chartex" xmlns:mc="http://schemas.openxmlformats.org/markup-compatibility/2006" xmlns:aink="http://schemas.microsoft.com/office/drawing/2016/ink" xmlns:am3d="http://schemas.microsoft.com/office/drawing/2017/model3d" xmlns:o="urn:schemas-microsoft-com:office:office" xmlns:r="http://schemas.openxmlformats.org/officeDocument/2006/relationships" xmlns:m="http://schemas.openxmlformats.org/officeDocument/2006/math" xmlns:v="urn:schemas-microsoft-com:vml" xmlns:wp14="http://schemas.microsoft.com/office/word/2010/wordprocessingDrawing" xmlns:wp="http://schemas.openxmlformats.org/drawingml/2006/wordprocessingDrawing" xmlns:w10="urn:schemas-microsoft-com:office:word" xmlns:w="http://schemas.openxmlformats.org/wordprocessingml/2006/main" xmlns:w14="http://schemas.microsoft.com/office/word/2010/wordml" xmlns:w15="http://schemas.microsoft.com/office/word/2012/wordml" xmlns:w16cex="http://schemas.microsoft.com/office/word/2018/wordml/cex" xmlns:w16cid="http://schemas.microsoft.com/office/word/2016/wordml/cid" xmlns:w16="http://schemas.microsoft.com/office/word/2018/wordml" xmlns:w16sdtdh="http://schemas.microsoft.com/office/word/2020/wordml/sdtdatahash" xmlns:w16se="http://schemas.microsoft.com/office/word/2015/wordml/symex" xmlns:wpg="http://schemas.microsoft.com/office/word/2010/wordprocessingGroup" xmlns:wpi="http://schemas.microsoft.com/office/word/2010/wordprocessingInk" xmlns:wne="http://schemas.microsoft.com/office/word/2006/wordml" xmlns:wps="http://schemas.microsoft.com/office/word/2010/wordprocessingShape" mc:Ignorable="w14 w15 w16se w16cid w16 w16cex w16sdtdh wp14">
   <w:tbl>
     <w:tblPr>
       <w:tblW w:w="9506" w:type="dxa"/>
@@ -7658,7 +8448,7 @@
 </file>
 
 <file path=word/numbering.xml><?xml version="1.0" encoding="utf-8"?>
-<w:numbering xmlns:wpc="http://schemas.microsoft.com/office/word/2010/wordprocessingCanvas" xmlns:cx="http://schemas.microsoft.com/office/drawing/2014/chartex" xmlns:cx1="http://schemas.microsoft.com/office/drawing/2015/9/8/chartex" xmlns:cx2="http://schemas.microsoft.com/office/drawing/2015/10/21/chartex" xmlns:cx3="http://schemas.microsoft.com/office/drawing/2016/5/9/chartex" xmlns:cx4="http://schemas.microsoft.com/office/drawing/2016/5/10/chartex" xmlns:cx5="http://schemas.microsoft.com/office/drawing/2016/5/11/chartex" xmlns:cx6="http://schemas.microsoft.com/office/drawing/2016/5/12/chartex" xmlns:cx7="http://schemas.microsoft.com/office/drawing/2016/5/13/chartex" xmlns:cx8="http://schemas.microsoft.com/office/drawing/2016/5/14/chartex" xmlns:mc="http://schemas.openxmlformats.org/markup-compatibility/2006" xmlns:aink="http://schemas.microsoft.com/office/drawing/2016/ink" xmlns:am3d="http://schemas.microsoft.com/office/drawing/2017/model3d" xmlns:o="urn:schemas-microsoft-com:office:office" xmlns:oel="http://schemas.microsoft.com/office/2019/extlst" xmlns:r="http://schemas.openxmlformats.org/officeDocument/2006/relationships" xmlns:m="http://schemas.openxmlformats.org/officeDocument/2006/math" xmlns:v="urn:schemas-microsoft-com:vml" xmlns:wp14="http://schemas.microsoft.com/office/word/2010/wordprocessingDrawing" xmlns:wp="http://schemas.openxmlformats.org/drawingml/2006/wordprocessingDrawing" xmlns:w10="urn:schemas-microsoft-com:office:word" xmlns:w="http://schemas.openxmlformats.org/wordprocessingml/2006/main" xmlns:w14="http://schemas.microsoft.com/office/word/2010/wordml" xmlns:w15="http://schemas.microsoft.com/office/word/2012/wordml" xmlns:w16cex="http://schemas.microsoft.com/office/word/2018/wordml/cex" xmlns:w16cid="http://schemas.microsoft.com/office/word/2016/wordml/cid" xmlns:w16="http://schemas.microsoft.com/office/word/2018/wordml" xmlns:w16du="http://schemas.microsoft.com/office/word/2023/wordml/word16du" xmlns:w16sdtdh="http://schemas.microsoft.com/office/word/2020/wordml/sdtdatahash" xmlns:w16sdtfl="http://schemas.microsoft.com/office/word/2024/wordml/sdtformatlock" xmlns:w16se="http://schemas.microsoft.com/office/word/2015/wordml/symex" xmlns:wpg="http://schemas.microsoft.com/office/word/2010/wordprocessingGroup" xmlns:wpi="http://schemas.microsoft.com/office/word/2010/wordprocessingInk" xmlns:wne="http://schemas.microsoft.com/office/word/2006/wordml" xmlns:wps="http://schemas.microsoft.com/office/word/2010/wordprocessingShape" mc:Ignorable="w14 w15 w16se w16cid w16 w16cex w16sdtdh w16sdtfl w16du wp14">
+<w:numbering xmlns:wpc="http://schemas.microsoft.com/office/word/2010/wordprocessingCanvas" xmlns:cx="http://schemas.microsoft.com/office/drawing/2014/chartex" xmlns:cx1="http://schemas.microsoft.com/office/drawing/2015/9/8/chartex" xmlns:cx2="http://schemas.microsoft.com/office/drawing/2015/10/21/chartex" xmlns:cx3="http://schemas.microsoft.com/office/drawing/2016/5/9/chartex" xmlns:cx4="http://schemas.microsoft.com/office/drawing/2016/5/10/chartex" xmlns:cx5="http://schemas.microsoft.com/office/drawing/2016/5/11/chartex" xmlns:cx6="http://schemas.microsoft.com/office/drawing/2016/5/12/chartex" xmlns:cx7="http://schemas.microsoft.com/office/drawing/2016/5/13/chartex" xmlns:cx8="http://schemas.microsoft.com/office/drawing/2016/5/14/chartex" xmlns:mc="http://schemas.openxmlformats.org/markup-compatibility/2006" xmlns:aink="http://schemas.microsoft.com/office/drawing/2016/ink" xmlns:am3d="http://schemas.microsoft.com/office/drawing/2017/model3d" xmlns:o="urn:schemas-microsoft-com:office:office" xmlns:r="http://schemas.openxmlformats.org/officeDocument/2006/relationships" xmlns:m="http://schemas.openxmlformats.org/officeDocument/2006/math" xmlns:v="urn:schemas-microsoft-com:vml" xmlns:wp14="http://schemas.microsoft.com/office/word/2010/wordprocessingDrawing" xmlns:wp="http://schemas.openxmlformats.org/drawingml/2006/wordprocessingDrawing" xmlns:w10="urn:schemas-microsoft-com:office:word" xmlns:w="http://schemas.openxmlformats.org/wordprocessingml/2006/main" xmlns:w14="http://schemas.microsoft.com/office/word/2010/wordml" xmlns:w15="http://schemas.microsoft.com/office/word/2012/wordml" xmlns:w16cex="http://schemas.microsoft.com/office/word/2018/wordml/cex" xmlns:w16cid="http://schemas.microsoft.com/office/word/2016/wordml/cid" xmlns:w16="http://schemas.microsoft.com/office/word/2018/wordml" xmlns:w16sdtdh="http://schemas.microsoft.com/office/word/2020/wordml/sdtdatahash" xmlns:w16se="http://schemas.microsoft.com/office/word/2015/wordml/symex" xmlns:wpg="http://schemas.microsoft.com/office/word/2010/wordprocessingGroup" xmlns:wpi="http://schemas.microsoft.com/office/word/2010/wordprocessingInk" xmlns:wne="http://schemas.microsoft.com/office/word/2006/wordml" xmlns:wps="http://schemas.microsoft.com/office/word/2010/wordprocessingShape" mc:Ignorable="w14 w15 w16se w16cid w16 w16cex w16sdtdh wp14">
   <w:abstractNum w:abstractNumId="0" w15:restartNumberingAfterBreak="0">
     <w:nsid w:val="01EA1774"/>
     <w:multiLevelType w:val="hybridMultilevel"/>
@@ -8272,47 +9062,47 @@
       <w:lvlJc w:val="left"/>
     </w:lvl>
   </w:abstractNum>
-  <w:num w:numId="1" w16cid:durableId="1206332949">
+  <w:num w:numId="1">
     <w:abstractNumId w:val="4"/>
     <w:lvlOverride w:ilvl="0">
       <w:startOverride w:val="1"/>
     </w:lvlOverride>
   </w:num>
-  <w:num w:numId="2" w16cid:durableId="1596016758">
+  <w:num w:numId="2">
     <w:abstractNumId w:val="7"/>
     <w:lvlOverride w:ilvl="0">
       <w:startOverride w:val="1"/>
     </w:lvlOverride>
   </w:num>
-  <w:num w:numId="3" w16cid:durableId="439254520">
+  <w:num w:numId="3">
     <w:abstractNumId w:val="2"/>
     <w:lvlOverride w:ilvl="0">
       <w:startOverride w:val="1"/>
     </w:lvlOverride>
   </w:num>
-  <w:num w:numId="4" w16cid:durableId="542058776">
+  <w:num w:numId="4">
     <w:abstractNumId w:val="2"/>
   </w:num>
-  <w:num w:numId="5" w16cid:durableId="42681472">
+  <w:num w:numId="5">
     <w:abstractNumId w:val="3"/>
   </w:num>
-  <w:num w:numId="6" w16cid:durableId="1788430513">
+  <w:num w:numId="6">
     <w:abstractNumId w:val="6"/>
   </w:num>
-  <w:num w:numId="7" w16cid:durableId="303396027">
+  <w:num w:numId="7">
     <w:abstractNumId w:val="1"/>
   </w:num>
-  <w:num w:numId="8" w16cid:durableId="1628389449">
+  <w:num w:numId="8">
     <w:abstractNumId w:val="8"/>
   </w:num>
-  <w:num w:numId="9" w16cid:durableId="1614095433">
+  <w:num w:numId="9">
     <w:abstractNumId w:val="0"/>
   </w:num>
 </w:numbering>
 </file>
 
 <file path=word/styles.xml><?xml version="1.0" encoding="utf-8"?>
-<w:styles xmlns:mc="http://schemas.openxmlformats.org/markup-compatibility/2006" xmlns:r="http://schemas.openxmlformats.org/officeDocument/2006/relationships" xmlns:w="http://schemas.openxmlformats.org/wordprocessingml/2006/main" xmlns:w14="http://schemas.microsoft.com/office/word/2010/wordml" xmlns:w15="http://schemas.microsoft.com/office/word/2012/wordml" xmlns:w16cex="http://schemas.microsoft.com/office/word/2018/wordml/cex" xmlns:w16cid="http://schemas.microsoft.com/office/word/2016/wordml/cid" xmlns:w16="http://schemas.microsoft.com/office/word/2018/wordml" xmlns:w16du="http://schemas.microsoft.com/office/word/2023/wordml/word16du" xmlns:w16sdtdh="http://schemas.microsoft.com/office/word/2020/wordml/sdtdatahash" xmlns:w16sdtfl="http://schemas.microsoft.com/office/word/2024/wordml/sdtformatlock" xmlns:w16se="http://schemas.microsoft.com/office/word/2015/wordml/symex" mc:Ignorable="w14 w15 w16se w16cid w16 w16cex w16sdtdh w16sdtfl w16du">
+<w:styles xmlns:mc="http://schemas.openxmlformats.org/markup-compatibility/2006" xmlns:r="http://schemas.openxmlformats.org/officeDocument/2006/relationships" xmlns:w="http://schemas.openxmlformats.org/wordprocessingml/2006/main" xmlns:w14="http://schemas.microsoft.com/office/word/2010/wordml" xmlns:w15="http://schemas.microsoft.com/office/word/2012/wordml" xmlns:w16cex="http://schemas.microsoft.com/office/word/2018/wordml/cex" xmlns:w16cid="http://schemas.microsoft.com/office/word/2016/wordml/cid" xmlns:w16="http://schemas.microsoft.com/office/word/2018/wordml" xmlns:w16sdtdh="http://schemas.microsoft.com/office/word/2020/wordml/sdtdatahash" xmlns:w16se="http://schemas.microsoft.com/office/word/2015/wordml/symex" mc:Ignorable="w14 w15 w16se w16cid w16 w16cex w16sdtdh">
   <w:docDefaults>
     <w:rPrDefault>
       <w:rPr>

</xml_diff>